<commit_message>
project report 1 start
</commit_message>
<xml_diff>
--- a/Week_04/ArogyaOne – Hospital Management System/ArogyaOne_Report/Part_3_Acknowledgement_Abstract_and_Table_of_Contents.docx
+++ b/Week_04/ArogyaOne – Hospital Management System/ArogyaOne_Report/Part_3_Acknowledgement_Abstract_and_Table_of_Contents.docx
@@ -903,6 +903,7 @@
           <w:bCs/>
           <w:sz w:val="24"/>
           <w:szCs w:val="24"/>
+          <w:lang w:val="en-US"/>
         </w:rPr>
       </w:pPr>
       <w:r>
@@ -911,13 +912,71 @@
           <w:bCs/>
           <w:sz w:val="24"/>
           <w:szCs w:val="24"/>
-        </w:rPr>
-        <w:t>This web-based Hospital Management System automates and digitizes daily healthcare operations, replacing manual record-keeping to reduce errors, minimize paperwork, and boost administrative efficiency. Powered by a centralized database, the system streamlines data access and improves inter-departmental coordination through structured, role-based access. Within this framework, an Admin manages core facility resources, Registration Staff handles patient appointments and admissions, Doctors conduct consultations and issue prescriptions, Laboratory Staff process medical reports, and Billing Staff manage patient invoices. Ultimately, this comprehensive digital solution ensures accurate data management and an optimized workflow for modern healthcare facilities.</w:t>
+          <w:lang w:val="en-US"/>
+        </w:rPr>
+        <w:t xml:space="preserve">Modern healthcare facilities require highly efficient, error-free management systems to handle increasing patient volumes and complex administrative workflows. </w:t>
+      </w:r>
+      <w:r>
+        <w:rPr>
+          <w:rFonts w:ascii="Times New Roman" w:hAnsi="Times New Roman" w:cs="Times New Roman"/>
+          <w:b/>
+          <w:bCs/>
+          <w:sz w:val="24"/>
+          <w:szCs w:val="24"/>
+          <w:lang w:val="en-US"/>
+        </w:rPr>
+        <w:t>ArogyaOne</w:t>
+      </w:r>
+      <w:r>
+        <w:rPr>
+          <w:rFonts w:ascii="Times New Roman" w:hAnsi="Times New Roman" w:cs="Times New Roman"/>
+          <w:bCs/>
+          <w:sz w:val="24"/>
+          <w:szCs w:val="24"/>
+          <w:lang w:val="en-US"/>
+        </w:rPr>
+        <w:t xml:space="preserve"> is a comprehensive, centralized Hospital Management System designed to digitize and streamline both clinical and operational processes. Developed utilizing the MERN stack (MongoDB, Express.js, React.js, Node.js), the platform implements a secure, role-based architecture to manage distinct hospital departments seamlessly.</w:t>
       </w:r>
     </w:p>
     <w:p>
       <w:pPr>
         <w:spacing w:after="0" w:line="360" w:lineRule="auto"/>
+        <w:jc w:val="both"/>
+        <w:rPr>
+          <w:rFonts w:ascii="Times New Roman" w:hAnsi="Times New Roman" w:cs="Times New Roman"/>
+          <w:bCs/>
+          <w:sz w:val="24"/>
+          <w:szCs w:val="24"/>
+          <w:lang w:val="en-US"/>
+        </w:rPr>
+      </w:pPr>
+    </w:p>
+    <w:p>
+      <w:pPr>
+        <w:spacing w:after="0" w:line="360" w:lineRule="auto"/>
+        <w:jc w:val="both"/>
+        <w:rPr>
+          <w:rFonts w:ascii="Times New Roman" w:hAnsi="Times New Roman" w:cs="Times New Roman"/>
+          <w:bCs/>
+          <w:sz w:val="24"/>
+          <w:szCs w:val="24"/>
+          <w:lang w:val="en-US"/>
+        </w:rPr>
+      </w:pPr>
+      <w:r>
+        <w:rPr>
+          <w:rFonts w:ascii="Times New Roman" w:hAnsi="Times New Roman" w:cs="Times New Roman"/>
+          <w:bCs/>
+          <w:sz w:val="24"/>
+          <w:szCs w:val="24"/>
+          <w:lang w:val="en-US"/>
+        </w:rPr>
+        <w:t>The system encompasses several core modules, including Outpatient (OPD) and Inpatient (IPD) Registration, dynamic Room and Facility Allocation, Laboratory diagnostics tracking, and Operation Theater (OT) management. A major technical highlight of ArogyaOne is its Centralized Billing engine, which automates complex financial aggregations—such as advance payment deductions and multi-department charge consolidation—while instantly generating NABH-compliant PDF invoices and discharge summaries. Furthermore, the platform features an advanced Admin Command Center equipped with real-time data visualization, live bed occupancy tracking, and financial analytics. Ultimately, ArogyaOne bridges the critical gap between clinical care and administrative oversight, delivering a highly optimized, paperless, and data-driven healthcare environment.</w:t>
+      </w:r>
+    </w:p>
+    <w:p>
+      <w:pPr>
+        <w:spacing w:after="0" w:line="360" w:lineRule="auto"/>
         <w:jc w:val="center"/>
         <w:rPr>
           <w:rFonts w:ascii="Times New Roman" w:hAnsi="Times New Roman" w:cs="Times New Roman"/>
@@ -977,7 +1036,6 @@
     <w:p>
       <w:pPr>
         <w:spacing w:after="0" w:line="360" w:lineRule="auto"/>
-        <w:jc w:val="right"/>
         <w:rPr>
           <w:rFonts w:ascii="Times New Roman" w:hAnsi="Times New Roman" w:cs="Times New Roman"/>
           <w:b/>
@@ -989,7 +1047,7 @@
     <w:p>
       <w:pPr>
         <w:spacing w:after="0" w:line="360" w:lineRule="auto"/>
-        <w:jc w:val="right"/>
+        <w:jc w:val="center"/>
         <w:rPr>
           <w:rFonts w:ascii="Times New Roman" w:hAnsi="Times New Roman" w:cs="Times New Roman"/>
           <w:b/>
@@ -1001,66 +1059,6 @@
     <w:p>
       <w:pPr>
         <w:spacing w:after="0" w:line="360" w:lineRule="auto"/>
-        <w:jc w:val="right"/>
-        <w:rPr>
-          <w:rFonts w:ascii="Times New Roman" w:hAnsi="Times New Roman" w:cs="Times New Roman"/>
-          <w:b/>
-          <w:sz w:val="40"/>
-          <w:szCs w:val="24"/>
-        </w:rPr>
-      </w:pPr>
-    </w:p>
-    <w:p>
-      <w:pPr>
-        <w:spacing w:after="0" w:line="360" w:lineRule="auto"/>
-        <w:jc w:val="right"/>
-        <w:rPr>
-          <w:rFonts w:ascii="Times New Roman" w:hAnsi="Times New Roman" w:cs="Times New Roman"/>
-          <w:b/>
-          <w:sz w:val="40"/>
-          <w:szCs w:val="24"/>
-        </w:rPr>
-      </w:pPr>
-    </w:p>
-    <w:p>
-      <w:pPr>
-        <w:spacing w:after="0" w:line="360" w:lineRule="auto"/>
-        <w:jc w:val="right"/>
-        <w:rPr>
-          <w:rFonts w:ascii="Times New Roman" w:hAnsi="Times New Roman" w:cs="Times New Roman"/>
-          <w:b/>
-          <w:sz w:val="40"/>
-          <w:szCs w:val="24"/>
-        </w:rPr>
-      </w:pPr>
-    </w:p>
-    <w:p>
-      <w:pPr>
-        <w:spacing w:after="0" w:line="360" w:lineRule="auto"/>
-        <w:jc w:val="right"/>
-        <w:rPr>
-          <w:rFonts w:ascii="Times New Roman" w:hAnsi="Times New Roman" w:cs="Times New Roman"/>
-          <w:b/>
-          <w:sz w:val="40"/>
-          <w:szCs w:val="24"/>
-        </w:rPr>
-      </w:pPr>
-    </w:p>
-    <w:p>
-      <w:pPr>
-        <w:spacing w:after="0" w:line="360" w:lineRule="auto"/>
-        <w:jc w:val="right"/>
-        <w:rPr>
-          <w:rFonts w:ascii="Times New Roman" w:hAnsi="Times New Roman" w:cs="Times New Roman"/>
-          <w:b/>
-          <w:sz w:val="40"/>
-          <w:szCs w:val="24"/>
-        </w:rPr>
-      </w:pPr>
-    </w:p>
-    <w:p>
-      <w:pPr>
-        <w:spacing w:after="0" w:line="360" w:lineRule="auto"/>
         <w:jc w:val="center"/>
         <w:rPr>
           <w:rFonts w:ascii="Times New Roman" w:hAnsi="Times New Roman" w:cs="Times New Roman"/>
@@ -1069,31 +1067,10 @@
           <w:szCs w:val="24"/>
         </w:rPr>
       </w:pPr>
-    </w:p>
-    <w:p>
-      <w:pPr>
-        <w:spacing w:after="0" w:line="360" w:lineRule="auto"/>
-        <w:jc w:val="center"/>
-        <w:rPr>
-          <w:rFonts w:ascii="Times New Roman" w:hAnsi="Times New Roman" w:cs="Times New Roman"/>
-          <w:b/>
-          <w:sz w:val="32"/>
-          <w:szCs w:val="24"/>
-        </w:rPr>
-      </w:pPr>
-      <w:r>
-        <w:rPr>
-          <w:rFonts w:ascii="Times New Roman" w:hAnsi="Times New Roman" w:cs="Times New Roman"/>
-          <w:b/>
-          <w:sz w:val="32"/>
-          <w:szCs w:val="24"/>
-        </w:rPr>
-        <w:lastRenderedPageBreak/>
-        <w:t>LIST OF FIGURES</w:t>
-      </w:r>
     </w:p>
     <w:tbl>
       <w:tblPr>
+        <w:tblpPr w:leftFromText="180" w:rightFromText="180" w:vertAnchor="text" w:horzAnchor="margin" w:tblpY="505"/>
         <w:tblW w:w="9026" w:type="dxa"/>
         <w:tblLayout w:type="fixed"/>
         <w:tblLook w:val="04A0" w:firstRow="1" w:lastRow="0" w:firstColumn="1" w:lastColumn="0" w:noHBand="0" w:noVBand="1"/>
@@ -1130,6 +1107,7 @@
                 <w:sz w:val="24"/>
                 <w:szCs w:val="24"/>
               </w:rPr>
+              <w:lastRenderedPageBreak/>
               <w:t>Figure No</w:t>
             </w:r>
           </w:p>
@@ -1254,14 +1232,6 @@
               </w:rPr>
               <w:t>1</w:t>
             </w:r>
-            <w:r>
-              <w:rPr>
-                <w:rFonts w:ascii="Times New Roman" w:hAnsi="Times New Roman" w:cs="Times New Roman"/>
-                <w:sz w:val="24"/>
-                <w:szCs w:val="24"/>
-              </w:rPr>
-              <w:t>.1</w:t>
-            </w:r>
           </w:p>
         </w:tc>
         <w:tc>
@@ -1287,15 +1257,63 @@
                 <w:sz w:val="24"/>
                 <w:szCs w:val="24"/>
               </w:rPr>
-              <w:t>C</w:t>
-            </w:r>
-            <w:r>
-              <w:rPr>
-                <w:rFonts w:ascii="Times New Roman" w:hAnsi="Times New Roman" w:cs="Times New Roman"/>
-                <w:sz w:val="24"/>
-                <w:szCs w:val="24"/>
-              </w:rPr>
-              <w:t>ontext diagram of library management system</w:t>
+              <w:t>Data Flow</w:t>
+            </w:r>
+            <w:r>
+              <w:rPr>
+                <w:rFonts w:ascii="Times New Roman" w:hAnsi="Times New Roman" w:cs="Times New Roman"/>
+                <w:sz w:val="24"/>
+                <w:szCs w:val="24"/>
+              </w:rPr>
+              <w:t xml:space="preserve"> diagram of </w:t>
+            </w:r>
+            <w:r>
+              <w:rPr>
+                <w:rFonts w:ascii="Times New Roman" w:hAnsi="Times New Roman" w:cs="Times New Roman"/>
+                <w:sz w:val="24"/>
+                <w:szCs w:val="24"/>
+              </w:rPr>
+              <w:t>Hospital</w:t>
+            </w:r>
+            <w:r>
+              <w:rPr>
+                <w:rFonts w:ascii="Times New Roman" w:hAnsi="Times New Roman" w:cs="Times New Roman"/>
+                <w:sz w:val="24"/>
+                <w:szCs w:val="24"/>
+              </w:rPr>
+              <w:t xml:space="preserve"> </w:t>
+            </w:r>
+            <w:r>
+              <w:rPr>
+                <w:rFonts w:ascii="Times New Roman" w:hAnsi="Times New Roman" w:cs="Times New Roman"/>
+                <w:sz w:val="24"/>
+                <w:szCs w:val="24"/>
+              </w:rPr>
+              <w:t>M</w:t>
+            </w:r>
+            <w:r>
+              <w:rPr>
+                <w:rFonts w:ascii="Times New Roman" w:hAnsi="Times New Roman" w:cs="Times New Roman"/>
+                <w:sz w:val="24"/>
+                <w:szCs w:val="24"/>
+              </w:rPr>
+              <w:t xml:space="preserve">anagement </w:t>
+            </w:r>
+            <w:r>
+              <w:rPr>
+                <w:rFonts w:ascii="Times New Roman" w:hAnsi="Times New Roman" w:cs="Times New Roman"/>
+                <w:sz w:val="24"/>
+                <w:szCs w:val="24"/>
+              </w:rPr>
+              <w:t>S</w:t>
+            </w:r>
+            <w:r>
+              <w:rPr>
+                <w:rFonts w:ascii="Times New Roman" w:hAnsi="Times New Roman" w:cs="Times New Roman"/>
+                <w:sz w:val="24"/>
+                <w:szCs w:val="24"/>
+              </w:rPr>
+              <w:t>ystem</w:t>
             </w:r>
           </w:p>
         </w:tc>
@@ -1323,7 +1341,7 @@
                 <w:sz w:val="24"/>
                 <w:szCs w:val="24"/>
               </w:rPr>
-              <w:t>4</w:t>
+              <w:t>6</w:t>
             </w:r>
           </w:p>
         </w:tc>
@@ -1379,22 +1397,6 @@
               </w:rPr>
               <w:t>2</w:t>
             </w:r>
-            <w:r>
-              <w:rPr>
-                <w:rFonts w:ascii="Times New Roman" w:hAnsi="Times New Roman" w:cs="Times New Roman"/>
-                <w:sz w:val="24"/>
-                <w:szCs w:val="24"/>
-              </w:rPr>
-              <w:t>.</w:t>
-            </w:r>
-            <w:r>
-              <w:rPr>
-                <w:rFonts w:ascii="Times New Roman" w:hAnsi="Times New Roman" w:cs="Times New Roman"/>
-                <w:sz w:val="24"/>
-                <w:szCs w:val="24"/>
-              </w:rPr>
-              <w:t>1</w:t>
-            </w:r>
           </w:p>
         </w:tc>
         <w:tc>
@@ -1420,7 +1422,71 @@
                 <w:sz w:val="24"/>
                 <w:szCs w:val="24"/>
               </w:rPr>
-              <w:t>Use case diagram of library management</w:t>
+              <w:t>Use</w:t>
+            </w:r>
+            <w:r>
+              <w:rPr>
+                <w:rFonts w:ascii="Times New Roman" w:hAnsi="Times New Roman" w:cs="Times New Roman"/>
+                <w:sz w:val="24"/>
+                <w:szCs w:val="24"/>
+              </w:rPr>
+              <w:t>-</w:t>
+            </w:r>
+            <w:r>
+              <w:rPr>
+                <w:rFonts w:ascii="Times New Roman" w:hAnsi="Times New Roman" w:cs="Times New Roman"/>
+                <w:sz w:val="24"/>
+                <w:szCs w:val="24"/>
+              </w:rPr>
+              <w:t xml:space="preserve">case diagram of </w:t>
+            </w:r>
+            <w:r>
+              <w:rPr>
+                <w:rFonts w:ascii="Times New Roman" w:hAnsi="Times New Roman" w:cs="Times New Roman"/>
+                <w:sz w:val="24"/>
+                <w:szCs w:val="24"/>
+              </w:rPr>
+              <w:t>Hospital</w:t>
+            </w:r>
+            <w:r>
+              <w:rPr>
+                <w:rFonts w:ascii="Times New Roman" w:hAnsi="Times New Roman" w:cs="Times New Roman"/>
+                <w:sz w:val="24"/>
+                <w:szCs w:val="24"/>
+              </w:rPr>
+              <w:t xml:space="preserve"> </w:t>
+            </w:r>
+            <w:r>
+              <w:rPr>
+                <w:rFonts w:ascii="Times New Roman" w:hAnsi="Times New Roman" w:cs="Times New Roman"/>
+                <w:sz w:val="24"/>
+                <w:szCs w:val="24"/>
+              </w:rPr>
+              <w:t>M</w:t>
+            </w:r>
+            <w:r>
+              <w:rPr>
+                <w:rFonts w:ascii="Times New Roman" w:hAnsi="Times New Roman" w:cs="Times New Roman"/>
+                <w:sz w:val="24"/>
+                <w:szCs w:val="24"/>
+              </w:rPr>
+              <w:t xml:space="preserve">anagement </w:t>
+            </w:r>
+            <w:r>
+              <w:rPr>
+                <w:rFonts w:ascii="Times New Roman" w:hAnsi="Times New Roman" w:cs="Times New Roman"/>
+                <w:sz w:val="24"/>
+                <w:szCs w:val="24"/>
+              </w:rPr>
+              <w:t>S</w:t>
+            </w:r>
+            <w:r>
+              <w:rPr>
+                <w:rFonts w:ascii="Times New Roman" w:hAnsi="Times New Roman" w:cs="Times New Roman"/>
+                <w:sz w:val="24"/>
+                <w:szCs w:val="24"/>
+              </w:rPr>
+              <w:t>ystem</w:t>
             </w:r>
           </w:p>
         </w:tc>
@@ -1448,7 +1514,7 @@
                 <w:sz w:val="24"/>
                 <w:szCs w:val="24"/>
               </w:rPr>
-              <w:t>5</w:t>
+              <w:t>7</w:t>
             </w:r>
           </w:p>
         </w:tc>
@@ -1472,6 +1538,14 @@
                 <w:szCs w:val="24"/>
               </w:rPr>
             </w:pPr>
+            <w:r>
+              <w:rPr>
+                <w:rFonts w:ascii="Times New Roman" w:hAnsi="Times New Roman" w:cs="Times New Roman"/>
+                <w:sz w:val="24"/>
+                <w:szCs w:val="24"/>
+              </w:rPr>
+              <w:t>3.1.4</w:t>
+            </w:r>
           </w:p>
         </w:tc>
         <w:tc>
@@ -1491,6 +1565,14 @@
                 <w:szCs w:val="24"/>
               </w:rPr>
             </w:pPr>
+            <w:r>
+              <w:rPr>
+                <w:rFonts w:ascii="Times New Roman" w:hAnsi="Times New Roman" w:cs="Times New Roman"/>
+                <w:sz w:val="24"/>
+                <w:szCs w:val="24"/>
+              </w:rPr>
+              <w:t>Activity diagrams of Hospital Management System</w:t>
+            </w:r>
           </w:p>
         </w:tc>
         <w:tc>
@@ -1511,6 +1593,14 @@
                 <w:szCs w:val="24"/>
               </w:rPr>
             </w:pPr>
+            <w:r>
+              <w:rPr>
+                <w:rFonts w:ascii="Times New Roman" w:hAnsi="Times New Roman" w:cs="Times New Roman"/>
+                <w:sz w:val="24"/>
+                <w:szCs w:val="24"/>
+              </w:rPr>
+              <w:t>11</w:t>
+            </w:r>
           </w:p>
         </w:tc>
       </w:tr>
@@ -1533,6 +1623,14 @@
                 <w:szCs w:val="24"/>
               </w:rPr>
             </w:pPr>
+            <w:r>
+              <w:rPr>
+                <w:rFonts w:ascii="Times New Roman" w:hAnsi="Times New Roman" w:cs="Times New Roman"/>
+                <w:sz w:val="24"/>
+                <w:szCs w:val="24"/>
+              </w:rPr>
+              <w:t>3.1.5</w:t>
+            </w:r>
           </w:p>
         </w:tc>
         <w:tc>
@@ -1552,6 +1650,54 @@
                 <w:szCs w:val="24"/>
               </w:rPr>
             </w:pPr>
+            <w:r>
+              <w:rPr>
+                <w:rFonts w:ascii="Times New Roman" w:hAnsi="Times New Roman" w:cs="Times New Roman"/>
+                <w:sz w:val="24"/>
+                <w:szCs w:val="24"/>
+              </w:rPr>
+              <w:t>Sequence diagram of Hospital</w:t>
+            </w:r>
+            <w:r>
+              <w:rPr>
+                <w:rFonts w:ascii="Times New Roman" w:hAnsi="Times New Roman" w:cs="Times New Roman"/>
+                <w:sz w:val="24"/>
+                <w:szCs w:val="24"/>
+              </w:rPr>
+              <w:t xml:space="preserve"> </w:t>
+            </w:r>
+            <w:r>
+              <w:rPr>
+                <w:rFonts w:ascii="Times New Roman" w:hAnsi="Times New Roman" w:cs="Times New Roman"/>
+                <w:sz w:val="24"/>
+                <w:szCs w:val="24"/>
+              </w:rPr>
+              <w:t>M</w:t>
+            </w:r>
+            <w:r>
+              <w:rPr>
+                <w:rFonts w:ascii="Times New Roman" w:hAnsi="Times New Roman" w:cs="Times New Roman"/>
+                <w:sz w:val="24"/>
+                <w:szCs w:val="24"/>
+              </w:rPr>
+              <w:t xml:space="preserve">anagement </w:t>
+            </w:r>
+            <w:r>
+              <w:rPr>
+                <w:rFonts w:ascii="Times New Roman" w:hAnsi="Times New Roman" w:cs="Times New Roman"/>
+                <w:sz w:val="24"/>
+                <w:szCs w:val="24"/>
+              </w:rPr>
+              <w:t>S</w:t>
+            </w:r>
+            <w:r>
+              <w:rPr>
+                <w:rFonts w:ascii="Times New Roman" w:hAnsi="Times New Roman" w:cs="Times New Roman"/>
+                <w:sz w:val="24"/>
+                <w:szCs w:val="24"/>
+              </w:rPr>
+              <w:t>ystem</w:t>
+            </w:r>
           </w:p>
         </w:tc>
         <w:tc>
@@ -1572,6 +1718,14 @@
                 <w:szCs w:val="24"/>
               </w:rPr>
             </w:pPr>
+            <w:r>
+              <w:rPr>
+                <w:rFonts w:ascii="Times New Roman" w:hAnsi="Times New Roman" w:cs="Times New Roman"/>
+                <w:sz w:val="24"/>
+                <w:szCs w:val="24"/>
+              </w:rPr>
+              <w:t>16</w:t>
+            </w:r>
           </w:p>
         </w:tc>
       </w:tr>
@@ -1594,6 +1748,14 @@
                 <w:szCs w:val="24"/>
               </w:rPr>
             </w:pPr>
+            <w:r>
+              <w:rPr>
+                <w:rFonts w:ascii="Times New Roman" w:hAnsi="Times New Roman" w:cs="Times New Roman"/>
+                <w:sz w:val="24"/>
+                <w:szCs w:val="24"/>
+              </w:rPr>
+              <w:t>3.1.6</w:t>
+            </w:r>
           </w:p>
         </w:tc>
         <w:tc>
@@ -1613,6 +1775,54 @@
                 <w:szCs w:val="24"/>
               </w:rPr>
             </w:pPr>
+            <w:r>
+              <w:rPr>
+                <w:rFonts w:ascii="Times New Roman" w:hAnsi="Times New Roman" w:cs="Times New Roman"/>
+                <w:sz w:val="24"/>
+                <w:szCs w:val="24"/>
+              </w:rPr>
+              <w:t>State diagrams of Hospital</w:t>
+            </w:r>
+            <w:r>
+              <w:rPr>
+                <w:rFonts w:ascii="Times New Roman" w:hAnsi="Times New Roman" w:cs="Times New Roman"/>
+                <w:sz w:val="24"/>
+                <w:szCs w:val="24"/>
+              </w:rPr>
+              <w:t xml:space="preserve"> </w:t>
+            </w:r>
+            <w:r>
+              <w:rPr>
+                <w:rFonts w:ascii="Times New Roman" w:hAnsi="Times New Roman" w:cs="Times New Roman"/>
+                <w:sz w:val="24"/>
+                <w:szCs w:val="24"/>
+              </w:rPr>
+              <w:t>M</w:t>
+            </w:r>
+            <w:r>
+              <w:rPr>
+                <w:rFonts w:ascii="Times New Roman" w:hAnsi="Times New Roman" w:cs="Times New Roman"/>
+                <w:sz w:val="24"/>
+                <w:szCs w:val="24"/>
+              </w:rPr>
+              <w:t xml:space="preserve">anagement </w:t>
+            </w:r>
+            <w:r>
+              <w:rPr>
+                <w:rFonts w:ascii="Times New Roman" w:hAnsi="Times New Roman" w:cs="Times New Roman"/>
+                <w:sz w:val="24"/>
+                <w:szCs w:val="24"/>
+              </w:rPr>
+              <w:t>S</w:t>
+            </w:r>
+            <w:r>
+              <w:rPr>
+                <w:rFonts w:ascii="Times New Roman" w:hAnsi="Times New Roman" w:cs="Times New Roman"/>
+                <w:sz w:val="24"/>
+                <w:szCs w:val="24"/>
+              </w:rPr>
+              <w:t>ystem</w:t>
+            </w:r>
           </w:p>
         </w:tc>
         <w:tc>
@@ -1633,10 +1843,472 @@
                 <w:szCs w:val="24"/>
               </w:rPr>
             </w:pPr>
+            <w:r>
+              <w:rPr>
+                <w:rFonts w:ascii="Times New Roman" w:hAnsi="Times New Roman" w:cs="Times New Roman"/>
+                <w:sz w:val="24"/>
+                <w:szCs w:val="24"/>
+              </w:rPr>
+              <w:t>17</w:t>
+            </w:r>
+          </w:p>
+        </w:tc>
+      </w:tr>
+      <w:tr>
+        <w:tc>
+          <w:tcPr>
+            <w:tcW w:w="1628" w:type="dxa"/>
+            <w:tcMar>
+              <w:left w:w="108" w:type="dxa"/>
+            </w:tcMar>
+            <w:vAlign w:val="center"/>
+          </w:tcPr>
+          <w:p>
+            <w:pPr>
+              <w:spacing w:after="0" w:line="360" w:lineRule="auto"/>
+              <w:jc w:val="center"/>
+              <w:rPr>
+                <w:rFonts w:ascii="Times New Roman" w:hAnsi="Times New Roman" w:cs="Times New Roman"/>
+                <w:sz w:val="24"/>
+                <w:szCs w:val="24"/>
+              </w:rPr>
+            </w:pPr>
+            <w:r>
+              <w:rPr>
+                <w:rFonts w:ascii="Times New Roman" w:hAnsi="Times New Roman" w:cs="Times New Roman"/>
+                <w:sz w:val="24"/>
+                <w:szCs w:val="24"/>
+              </w:rPr>
+              <w:t>3.1.7</w:t>
+            </w:r>
+          </w:p>
+        </w:tc>
+        <w:tc>
+          <w:tcPr>
+            <w:tcW w:w="5951" w:type="dxa"/>
+            <w:tcMar>
+              <w:left w:w="108" w:type="dxa"/>
+            </w:tcMar>
+            <w:vAlign w:val="center"/>
+          </w:tcPr>
+          <w:p>
+            <w:pPr>
+              <w:spacing w:after="0" w:line="360" w:lineRule="auto"/>
+              <w:rPr>
+                <w:rFonts w:ascii="Times New Roman" w:hAnsi="Times New Roman" w:cs="Times New Roman"/>
+                <w:sz w:val="24"/>
+                <w:szCs w:val="24"/>
+              </w:rPr>
+            </w:pPr>
+            <w:r>
+              <w:rPr>
+                <w:rFonts w:ascii="Times New Roman" w:hAnsi="Times New Roman" w:cs="Times New Roman"/>
+                <w:sz w:val="24"/>
+                <w:szCs w:val="24"/>
+              </w:rPr>
+              <w:t>Class diagram of Hospital</w:t>
+            </w:r>
+            <w:r>
+              <w:rPr>
+                <w:rFonts w:ascii="Times New Roman" w:hAnsi="Times New Roman" w:cs="Times New Roman"/>
+                <w:sz w:val="24"/>
+                <w:szCs w:val="24"/>
+              </w:rPr>
+              <w:t xml:space="preserve"> </w:t>
+            </w:r>
+            <w:r>
+              <w:rPr>
+                <w:rFonts w:ascii="Times New Roman" w:hAnsi="Times New Roman" w:cs="Times New Roman"/>
+                <w:sz w:val="24"/>
+                <w:szCs w:val="24"/>
+              </w:rPr>
+              <w:t>M</w:t>
+            </w:r>
+            <w:r>
+              <w:rPr>
+                <w:rFonts w:ascii="Times New Roman" w:hAnsi="Times New Roman" w:cs="Times New Roman"/>
+                <w:sz w:val="24"/>
+                <w:szCs w:val="24"/>
+              </w:rPr>
+              <w:t xml:space="preserve">anagement </w:t>
+            </w:r>
+            <w:r>
+              <w:rPr>
+                <w:rFonts w:ascii="Times New Roman" w:hAnsi="Times New Roman" w:cs="Times New Roman"/>
+                <w:sz w:val="24"/>
+                <w:szCs w:val="24"/>
+              </w:rPr>
+              <w:t>S</w:t>
+            </w:r>
+            <w:r>
+              <w:rPr>
+                <w:rFonts w:ascii="Times New Roman" w:hAnsi="Times New Roman" w:cs="Times New Roman"/>
+                <w:sz w:val="24"/>
+                <w:szCs w:val="24"/>
+              </w:rPr>
+              <w:t>ystem</w:t>
+            </w:r>
+          </w:p>
+        </w:tc>
+        <w:tc>
+          <w:tcPr>
+            <w:tcW w:w="1447" w:type="dxa"/>
+            <w:tcMar>
+              <w:left w:w="108" w:type="dxa"/>
+            </w:tcMar>
+            <w:vAlign w:val="center"/>
+          </w:tcPr>
+          <w:p>
+            <w:pPr>
+              <w:spacing w:after="0" w:line="360" w:lineRule="auto"/>
+              <w:jc w:val="center"/>
+              <w:rPr>
+                <w:rFonts w:ascii="Times New Roman" w:hAnsi="Times New Roman" w:cs="Times New Roman"/>
+                <w:sz w:val="24"/>
+                <w:szCs w:val="24"/>
+              </w:rPr>
+            </w:pPr>
+            <w:r>
+              <w:rPr>
+                <w:rFonts w:ascii="Times New Roman" w:hAnsi="Times New Roman" w:cs="Times New Roman"/>
+                <w:sz w:val="24"/>
+                <w:szCs w:val="24"/>
+              </w:rPr>
+              <w:t>22</w:t>
+            </w:r>
+          </w:p>
+        </w:tc>
+      </w:tr>
+      <w:tr>
+        <w:tc>
+          <w:tcPr>
+            <w:tcW w:w="1628" w:type="dxa"/>
+            <w:tcMar>
+              <w:left w:w="108" w:type="dxa"/>
+            </w:tcMar>
+            <w:vAlign w:val="center"/>
+          </w:tcPr>
+          <w:p>
+            <w:pPr>
+              <w:spacing w:after="0" w:line="360" w:lineRule="auto"/>
+              <w:jc w:val="center"/>
+              <w:rPr>
+                <w:rFonts w:ascii="Times New Roman" w:hAnsi="Times New Roman" w:cs="Times New Roman"/>
+                <w:sz w:val="24"/>
+                <w:szCs w:val="24"/>
+              </w:rPr>
+            </w:pPr>
+            <w:r>
+              <w:rPr>
+                <w:rFonts w:ascii="Times New Roman" w:hAnsi="Times New Roman" w:cs="Times New Roman"/>
+                <w:sz w:val="24"/>
+                <w:szCs w:val="24"/>
+              </w:rPr>
+              <w:t>3.2.2</w:t>
+            </w:r>
+          </w:p>
+        </w:tc>
+        <w:tc>
+          <w:tcPr>
+            <w:tcW w:w="5951" w:type="dxa"/>
+            <w:tcMar>
+              <w:left w:w="108" w:type="dxa"/>
+            </w:tcMar>
+            <w:vAlign w:val="center"/>
+          </w:tcPr>
+          <w:p>
+            <w:pPr>
+              <w:spacing w:after="0" w:line="360" w:lineRule="auto"/>
+              <w:rPr>
+                <w:rFonts w:ascii="Times New Roman" w:hAnsi="Times New Roman" w:cs="Times New Roman"/>
+                <w:sz w:val="24"/>
+                <w:szCs w:val="24"/>
+              </w:rPr>
+            </w:pPr>
+            <w:r>
+              <w:rPr>
+                <w:rFonts w:ascii="Times New Roman" w:hAnsi="Times New Roman" w:cs="Times New Roman"/>
+                <w:sz w:val="24"/>
+                <w:szCs w:val="24"/>
+              </w:rPr>
+              <w:t>ER diagram of Hospital</w:t>
+            </w:r>
+            <w:r>
+              <w:rPr>
+                <w:rFonts w:ascii="Times New Roman" w:hAnsi="Times New Roman" w:cs="Times New Roman"/>
+                <w:sz w:val="24"/>
+                <w:szCs w:val="24"/>
+              </w:rPr>
+              <w:t xml:space="preserve"> </w:t>
+            </w:r>
+            <w:r>
+              <w:rPr>
+                <w:rFonts w:ascii="Times New Roman" w:hAnsi="Times New Roman" w:cs="Times New Roman"/>
+                <w:sz w:val="24"/>
+                <w:szCs w:val="24"/>
+              </w:rPr>
+              <w:t>M</w:t>
+            </w:r>
+            <w:r>
+              <w:rPr>
+                <w:rFonts w:ascii="Times New Roman" w:hAnsi="Times New Roman" w:cs="Times New Roman"/>
+                <w:sz w:val="24"/>
+                <w:szCs w:val="24"/>
+              </w:rPr>
+              <w:t xml:space="preserve">anagement </w:t>
+            </w:r>
+            <w:r>
+              <w:rPr>
+                <w:rFonts w:ascii="Times New Roman" w:hAnsi="Times New Roman" w:cs="Times New Roman"/>
+                <w:sz w:val="24"/>
+                <w:szCs w:val="24"/>
+              </w:rPr>
+              <w:t>S</w:t>
+            </w:r>
+            <w:r>
+              <w:rPr>
+                <w:rFonts w:ascii="Times New Roman" w:hAnsi="Times New Roman" w:cs="Times New Roman"/>
+                <w:sz w:val="24"/>
+                <w:szCs w:val="24"/>
+              </w:rPr>
+              <w:t>ystem</w:t>
+            </w:r>
+          </w:p>
+        </w:tc>
+        <w:tc>
+          <w:tcPr>
+            <w:tcW w:w="1447" w:type="dxa"/>
+            <w:tcMar>
+              <w:left w:w="108" w:type="dxa"/>
+            </w:tcMar>
+            <w:vAlign w:val="center"/>
+          </w:tcPr>
+          <w:p>
+            <w:pPr>
+              <w:spacing w:after="0" w:line="360" w:lineRule="auto"/>
+              <w:jc w:val="center"/>
+              <w:rPr>
+                <w:rFonts w:ascii="Times New Roman" w:hAnsi="Times New Roman" w:cs="Times New Roman"/>
+                <w:sz w:val="24"/>
+                <w:szCs w:val="24"/>
+              </w:rPr>
+            </w:pPr>
+            <w:r>
+              <w:rPr>
+                <w:rFonts w:ascii="Times New Roman" w:hAnsi="Times New Roman" w:cs="Times New Roman"/>
+                <w:sz w:val="24"/>
+                <w:szCs w:val="24"/>
+              </w:rPr>
+              <w:t>29</w:t>
+            </w:r>
+          </w:p>
+        </w:tc>
+      </w:tr>
+      <w:tr>
+        <w:tc>
+          <w:tcPr>
+            <w:tcW w:w="1628" w:type="dxa"/>
+            <w:tcMar>
+              <w:left w:w="108" w:type="dxa"/>
+            </w:tcMar>
+            <w:vAlign w:val="center"/>
+          </w:tcPr>
+          <w:p>
+            <w:pPr>
+              <w:spacing w:after="0" w:line="360" w:lineRule="auto"/>
+              <w:jc w:val="center"/>
+              <w:rPr>
+                <w:rFonts w:ascii="Times New Roman" w:hAnsi="Times New Roman" w:cs="Times New Roman"/>
+                <w:sz w:val="24"/>
+                <w:szCs w:val="24"/>
+              </w:rPr>
+            </w:pPr>
+          </w:p>
+        </w:tc>
+        <w:tc>
+          <w:tcPr>
+            <w:tcW w:w="5951" w:type="dxa"/>
+            <w:tcMar>
+              <w:left w:w="108" w:type="dxa"/>
+            </w:tcMar>
+            <w:vAlign w:val="center"/>
+          </w:tcPr>
+          <w:p>
+            <w:pPr>
+              <w:spacing w:after="0" w:line="360" w:lineRule="auto"/>
+              <w:rPr>
+                <w:rFonts w:ascii="Times New Roman" w:hAnsi="Times New Roman" w:cs="Times New Roman"/>
+                <w:sz w:val="24"/>
+                <w:szCs w:val="24"/>
+              </w:rPr>
+            </w:pPr>
+          </w:p>
+        </w:tc>
+        <w:tc>
+          <w:tcPr>
+            <w:tcW w:w="1447" w:type="dxa"/>
+            <w:tcMar>
+              <w:left w:w="108" w:type="dxa"/>
+            </w:tcMar>
+            <w:vAlign w:val="center"/>
+          </w:tcPr>
+          <w:p>
+            <w:pPr>
+              <w:spacing w:after="0" w:line="360" w:lineRule="auto"/>
+              <w:jc w:val="center"/>
+              <w:rPr>
+                <w:rFonts w:ascii="Times New Roman" w:hAnsi="Times New Roman" w:cs="Times New Roman"/>
+                <w:sz w:val="24"/>
+                <w:szCs w:val="24"/>
+              </w:rPr>
+            </w:pPr>
+          </w:p>
+        </w:tc>
+      </w:tr>
+      <w:tr>
+        <w:tc>
+          <w:tcPr>
+            <w:tcW w:w="1628" w:type="dxa"/>
+            <w:tcMar>
+              <w:left w:w="108" w:type="dxa"/>
+            </w:tcMar>
+            <w:vAlign w:val="center"/>
+          </w:tcPr>
+          <w:p>
+            <w:pPr>
+              <w:spacing w:after="0" w:line="360" w:lineRule="auto"/>
+              <w:jc w:val="center"/>
+              <w:rPr>
+                <w:rFonts w:ascii="Times New Roman" w:hAnsi="Times New Roman" w:cs="Times New Roman"/>
+                <w:sz w:val="24"/>
+                <w:szCs w:val="24"/>
+              </w:rPr>
+            </w:pPr>
+          </w:p>
+        </w:tc>
+        <w:tc>
+          <w:tcPr>
+            <w:tcW w:w="5951" w:type="dxa"/>
+            <w:tcMar>
+              <w:left w:w="108" w:type="dxa"/>
+            </w:tcMar>
+            <w:vAlign w:val="center"/>
+          </w:tcPr>
+          <w:p>
+            <w:pPr>
+              <w:spacing w:after="0" w:line="360" w:lineRule="auto"/>
+              <w:rPr>
+                <w:rFonts w:ascii="Times New Roman" w:hAnsi="Times New Roman" w:cs="Times New Roman"/>
+                <w:sz w:val="24"/>
+                <w:szCs w:val="24"/>
+              </w:rPr>
+            </w:pPr>
+          </w:p>
+        </w:tc>
+        <w:tc>
+          <w:tcPr>
+            <w:tcW w:w="1447" w:type="dxa"/>
+            <w:tcMar>
+              <w:left w:w="108" w:type="dxa"/>
+            </w:tcMar>
+            <w:vAlign w:val="center"/>
+          </w:tcPr>
+          <w:p>
+            <w:pPr>
+              <w:spacing w:after="0" w:line="360" w:lineRule="auto"/>
+              <w:jc w:val="center"/>
+              <w:rPr>
+                <w:rFonts w:ascii="Times New Roman" w:hAnsi="Times New Roman" w:cs="Times New Roman"/>
+                <w:sz w:val="24"/>
+                <w:szCs w:val="24"/>
+              </w:rPr>
+            </w:pPr>
+          </w:p>
+        </w:tc>
+      </w:tr>
+      <w:tr>
+        <w:tc>
+          <w:tcPr>
+            <w:tcW w:w="1628" w:type="dxa"/>
+            <w:tcMar>
+              <w:left w:w="108" w:type="dxa"/>
+            </w:tcMar>
+            <w:vAlign w:val="center"/>
+          </w:tcPr>
+          <w:p>
+            <w:pPr>
+              <w:spacing w:after="0" w:line="360" w:lineRule="auto"/>
+              <w:jc w:val="center"/>
+              <w:rPr>
+                <w:rFonts w:ascii="Times New Roman" w:hAnsi="Times New Roman" w:cs="Times New Roman"/>
+                <w:sz w:val="24"/>
+                <w:szCs w:val="24"/>
+              </w:rPr>
+            </w:pPr>
+          </w:p>
+        </w:tc>
+        <w:tc>
+          <w:tcPr>
+            <w:tcW w:w="5951" w:type="dxa"/>
+            <w:tcMar>
+              <w:left w:w="108" w:type="dxa"/>
+            </w:tcMar>
+            <w:vAlign w:val="center"/>
+          </w:tcPr>
+          <w:p>
+            <w:pPr>
+              <w:spacing w:after="0" w:line="360" w:lineRule="auto"/>
+              <w:rPr>
+                <w:rFonts w:ascii="Times New Roman" w:hAnsi="Times New Roman" w:cs="Times New Roman"/>
+                <w:sz w:val="24"/>
+                <w:szCs w:val="24"/>
+              </w:rPr>
+            </w:pPr>
+          </w:p>
+        </w:tc>
+        <w:tc>
+          <w:tcPr>
+            <w:tcW w:w="1447" w:type="dxa"/>
+            <w:tcMar>
+              <w:left w:w="108" w:type="dxa"/>
+            </w:tcMar>
+            <w:vAlign w:val="center"/>
+          </w:tcPr>
+          <w:p>
+            <w:pPr>
+              <w:spacing w:after="0" w:line="360" w:lineRule="auto"/>
+              <w:jc w:val="center"/>
+              <w:rPr>
+                <w:rFonts w:ascii="Times New Roman" w:hAnsi="Times New Roman" w:cs="Times New Roman"/>
+                <w:sz w:val="24"/>
+                <w:szCs w:val="24"/>
+              </w:rPr>
+            </w:pPr>
           </w:p>
         </w:tc>
       </w:tr>
     </w:tbl>
+    <w:p>
+      <w:pPr>
+        <w:spacing w:after="0" w:line="360" w:lineRule="auto"/>
+        <w:jc w:val="center"/>
+        <w:rPr>
+          <w:rFonts w:ascii="Times New Roman" w:hAnsi="Times New Roman" w:cs="Times New Roman"/>
+          <w:b/>
+          <w:sz w:val="32"/>
+          <w:szCs w:val="24"/>
+        </w:rPr>
+      </w:pPr>
+      <w:r>
+        <w:rPr>
+          <w:rFonts w:ascii="Times New Roman" w:hAnsi="Times New Roman" w:cs="Times New Roman"/>
+          <w:b/>
+          <w:sz w:val="32"/>
+          <w:szCs w:val="24"/>
+        </w:rPr>
+        <w:t>LIST OF FIGURES</w:t>
+      </w:r>
+    </w:p>
     <w:p>
       <w:pPr>
         <w:spacing w:after="0" w:line="360" w:lineRule="auto"/>
@@ -7501,7 +8173,6 @@
   <w:style w:type="character" w:default="1" w:styleId="DefaultParagraphFont">
     <w:name w:val="Default Paragraph Font"/>
     <w:uiPriority w:val="1"/>
-    <w:semiHidden/>
     <w:unhideWhenUsed/>
   </w:style>
   <w:style w:type="table" w:default="1" w:styleId="TableNormal">
@@ -8024,10 +8695,6 @@
 </file>
 
 <file path=customXml/item1.xml><?xml version="1.0" encoding="utf-8"?>
-<b:Sources xmlns:b="http://schemas.openxmlformats.org/officeDocument/2006/bibliography" xmlns="http://schemas.openxmlformats.org/officeDocument/2006/bibliography" SelectedStyle="\APASixthEditionOfficeOnline.xsl" StyleName="APA" Version="6"/>
-</file>
-
-<file path=customXml/item2.xml><?xml version="1.0" encoding="utf-8"?>
 <s:customData xmlns="http://www.wps.cn/officeDocument/2013/wpsCustomData" xmlns:s="http://www.wps.cn/officeDocument/2013/wpsCustomData">
   <customSectProps>
     <customSectPr/>
@@ -8035,18 +8702,22 @@
 </s:customData>
 </file>
 
+<file path=customXml/item2.xml><?xml version="1.0" encoding="utf-8"?>
+<b:Sources xmlns:b="http://schemas.openxmlformats.org/officeDocument/2006/bibliography" xmlns="http://schemas.openxmlformats.org/officeDocument/2006/bibliography" SelectedStyle="\APASixthEditionOfficeOnline.xsl" StyleName="APA" Version="6"/>
+</file>
+
 <file path=customXml/itemProps1.xml><?xml version="1.0" encoding="utf-8"?>
+<ds:datastoreItem xmlns:ds="http://schemas.openxmlformats.org/officeDocument/2006/customXml" ds:itemID="{B1977F7D-205B-4081-913C-38D41E755F92}">
+  <ds:schemaRefs>
+    <ds:schemaRef ds:uri="http://www.wps.cn/officeDocument/2013/wpsCustomData"/>
+  </ds:schemaRefs>
+</ds:datastoreItem>
+</file>
+
+<file path=customXml/itemProps2.xml><?xml version="1.0" encoding="utf-8"?>
 <ds:datastoreItem xmlns:ds="http://schemas.openxmlformats.org/officeDocument/2006/customXml" ds:itemID="{1A27E352-9BE0-4888-A060-6C880FD98FF3}">
   <ds:schemaRefs>
     <ds:schemaRef ds:uri="http://schemas.openxmlformats.org/officeDocument/2006/bibliography"/>
   </ds:schemaRefs>
 </ds:datastoreItem>
-</file>
-
-<file path=customXml/itemProps2.xml><?xml version="1.0" encoding="utf-8"?>
-<ds:datastoreItem xmlns:ds="http://schemas.openxmlformats.org/officeDocument/2006/customXml" ds:itemID="{B1977F7D-205B-4081-913C-38D41E755F92}">
-  <ds:schemaRefs>
-    <ds:schemaRef ds:uri="http://www.wps.cn/officeDocument/2013/wpsCustomData"/>
-  </ds:schemaRefs>
-</ds:datastoreItem>
 </file>
</xml_diff>

<commit_message>
Update Part 3 Acknowladgement
</commit_message>
<xml_diff>
--- a/Week_04/ArogyaOne – Hospital Management System/ArogyaOne_Report/Part_3_Acknowledgement_Abstract_and_Table_of_Contents.docx
+++ b/Week_04/ArogyaOne – Hospital Management System/ArogyaOne_Report/Part_3_Acknowledgement_Abstract_and_Table_of_Contents.docx
@@ -861,7 +861,6 @@
           <w:szCs w:val="24"/>
         </w:rPr>
       </w:pPr>
-      <w:proofErr w:type="spellStart"/>
       <w:r>
         <w:rPr>
           <w:rFonts w:ascii="Times New Roman" w:hAnsi="Times New Roman" w:cs="Times New Roman"/>
@@ -870,18 +869,7 @@
           <w:sz w:val="32"/>
           <w:szCs w:val="24"/>
         </w:rPr>
-        <w:t>ArogyaOne</w:t>
-      </w:r>
-      <w:proofErr w:type="spellEnd"/>
-      <w:r>
-        <w:rPr>
-          <w:rFonts w:ascii="Times New Roman" w:hAnsi="Times New Roman" w:cs="Times New Roman"/>
-          <w:b/>
-          <w:color w:val="FF0000"/>
-          <w:sz w:val="32"/>
-          <w:szCs w:val="24"/>
-        </w:rPr>
-        <w:t xml:space="preserve"> </w:t>
+        <w:t xml:space="preserve">ArogyaOne </w:t>
       </w:r>
       <w:r>
         <w:rPr>
@@ -2672,7 +2660,15 @@
                 <w:sz w:val="24"/>
                 <w:szCs w:val="24"/>
               </w:rPr>
-              <w:t>3.9.1</w:t>
+              <w:t>3.</w:t>
+            </w:r>
+            <w:r>
+              <w:rPr>
+                <w:rFonts w:ascii="Times New Roman" w:hAnsi="Times New Roman" w:cs="Times New Roman"/>
+                <w:sz w:val="24"/>
+                <w:szCs w:val="24"/>
+              </w:rPr>
+              <w:t>2.1.1</w:t>
             </w:r>
           </w:p>
         </w:tc>
@@ -2699,7 +2695,7 @@
                 <w:sz w:val="24"/>
                 <w:szCs w:val="24"/>
               </w:rPr>
-              <w:t>Book</w:t>
+              <w:t>User</w:t>
             </w:r>
           </w:p>
         </w:tc>
@@ -2727,15 +2723,7 @@
                 <w:sz w:val="24"/>
                 <w:szCs w:val="24"/>
               </w:rPr>
-              <w:t>1</w:t>
-            </w:r>
-            <w:r>
-              <w:rPr>
-                <w:rFonts w:ascii="Times New Roman" w:hAnsi="Times New Roman" w:cs="Times New Roman"/>
-                <w:sz w:val="24"/>
-                <w:szCs w:val="24"/>
-              </w:rPr>
-              <w:t>1</w:t>
+              <w:t>23</w:t>
             </w:r>
           </w:p>
         </w:tc>
@@ -2765,7 +2753,31 @@
                 <w:sz w:val="24"/>
                 <w:szCs w:val="24"/>
               </w:rPr>
-              <w:t>3.9.2</w:t>
+              <w:t>3.</w:t>
+            </w:r>
+            <w:r>
+              <w:rPr>
+                <w:rFonts w:ascii="Times New Roman" w:hAnsi="Times New Roman" w:cs="Times New Roman"/>
+                <w:sz w:val="24"/>
+                <w:szCs w:val="24"/>
+              </w:rPr>
+              <w:t>2</w:t>
+            </w:r>
+            <w:r>
+              <w:rPr>
+                <w:rFonts w:ascii="Times New Roman" w:hAnsi="Times New Roman" w:cs="Times New Roman"/>
+                <w:sz w:val="24"/>
+                <w:szCs w:val="24"/>
+              </w:rPr>
+              <w:t>.</w:t>
+            </w:r>
+            <w:r>
+              <w:rPr>
+                <w:rFonts w:ascii="Times New Roman" w:hAnsi="Times New Roman" w:cs="Times New Roman"/>
+                <w:sz w:val="24"/>
+                <w:szCs w:val="24"/>
+              </w:rPr>
+              <w:t>1.2</w:t>
             </w:r>
           </w:p>
         </w:tc>
@@ -2792,7 +2804,7 @@
                 <w:sz w:val="24"/>
                 <w:szCs w:val="24"/>
               </w:rPr>
-              <w:t>Borrower</w:t>
+              <w:t>Doctor</w:t>
             </w:r>
           </w:p>
         </w:tc>
@@ -2820,15 +2832,7 @@
                 <w:sz w:val="24"/>
                 <w:szCs w:val="24"/>
               </w:rPr>
-              <w:t>1</w:t>
-            </w:r>
-            <w:r>
-              <w:rPr>
-                <w:rFonts w:ascii="Times New Roman" w:hAnsi="Times New Roman" w:cs="Times New Roman"/>
-                <w:sz w:val="24"/>
-                <w:szCs w:val="24"/>
-              </w:rPr>
-              <w:t>1</w:t>
+              <w:t>23</w:t>
             </w:r>
           </w:p>
         </w:tc>
@@ -2852,6 +2856,38 @@
                 <w:szCs w:val="24"/>
               </w:rPr>
             </w:pPr>
+            <w:r>
+              <w:rPr>
+                <w:rFonts w:ascii="Times New Roman" w:hAnsi="Times New Roman" w:cs="Times New Roman"/>
+                <w:sz w:val="24"/>
+                <w:szCs w:val="24"/>
+              </w:rPr>
+              <w:t>3.</w:t>
+            </w:r>
+            <w:r>
+              <w:rPr>
+                <w:rFonts w:ascii="Times New Roman" w:hAnsi="Times New Roman" w:cs="Times New Roman"/>
+                <w:sz w:val="24"/>
+                <w:szCs w:val="24"/>
+              </w:rPr>
+              <w:t>2</w:t>
+            </w:r>
+            <w:r>
+              <w:rPr>
+                <w:rFonts w:ascii="Times New Roman" w:hAnsi="Times New Roman" w:cs="Times New Roman"/>
+                <w:sz w:val="24"/>
+                <w:szCs w:val="24"/>
+              </w:rPr>
+              <w:t>.</w:t>
+            </w:r>
+            <w:r>
+              <w:rPr>
+                <w:rFonts w:ascii="Times New Roman" w:hAnsi="Times New Roman" w:cs="Times New Roman"/>
+                <w:sz w:val="24"/>
+                <w:szCs w:val="24"/>
+              </w:rPr>
+              <w:t>1.3</w:t>
+            </w:r>
           </w:p>
         </w:tc>
         <w:tc>
@@ -2871,6 +2907,14 @@
                 <w:szCs w:val="24"/>
               </w:rPr>
             </w:pPr>
+            <w:r>
+              <w:rPr>
+                <w:rFonts w:ascii="Times New Roman" w:hAnsi="Times New Roman" w:cs="Times New Roman"/>
+                <w:sz w:val="24"/>
+                <w:szCs w:val="24"/>
+              </w:rPr>
+              <w:t>Patients</w:t>
+            </w:r>
           </w:p>
         </w:tc>
         <w:tc>
@@ -2891,6 +2935,14 @@
                 <w:szCs w:val="24"/>
               </w:rPr>
             </w:pPr>
+            <w:r>
+              <w:rPr>
+                <w:rFonts w:ascii="Times New Roman" w:hAnsi="Times New Roman" w:cs="Times New Roman"/>
+                <w:sz w:val="24"/>
+                <w:szCs w:val="24"/>
+              </w:rPr>
+              <w:t>24</w:t>
+            </w:r>
           </w:p>
         </w:tc>
       </w:tr>
@@ -2913,6 +2965,38 @@
                 <w:szCs w:val="24"/>
               </w:rPr>
             </w:pPr>
+            <w:r>
+              <w:rPr>
+                <w:rFonts w:ascii="Times New Roman" w:hAnsi="Times New Roman" w:cs="Times New Roman"/>
+                <w:sz w:val="24"/>
+                <w:szCs w:val="24"/>
+              </w:rPr>
+              <w:t>3.</w:t>
+            </w:r>
+            <w:r>
+              <w:rPr>
+                <w:rFonts w:ascii="Times New Roman" w:hAnsi="Times New Roman" w:cs="Times New Roman"/>
+                <w:sz w:val="24"/>
+                <w:szCs w:val="24"/>
+              </w:rPr>
+              <w:t>2</w:t>
+            </w:r>
+            <w:r>
+              <w:rPr>
+                <w:rFonts w:ascii="Times New Roman" w:hAnsi="Times New Roman" w:cs="Times New Roman"/>
+                <w:sz w:val="24"/>
+                <w:szCs w:val="24"/>
+              </w:rPr>
+              <w:t>.</w:t>
+            </w:r>
+            <w:r>
+              <w:rPr>
+                <w:rFonts w:ascii="Times New Roman" w:hAnsi="Times New Roman" w:cs="Times New Roman"/>
+                <w:sz w:val="24"/>
+                <w:szCs w:val="24"/>
+              </w:rPr>
+              <w:t>1.4</w:t>
+            </w:r>
           </w:p>
         </w:tc>
         <w:tc>
@@ -2932,6 +3016,14 @@
                 <w:szCs w:val="24"/>
               </w:rPr>
             </w:pPr>
+            <w:r>
+              <w:rPr>
+                <w:rFonts w:ascii="Times New Roman" w:hAnsi="Times New Roman" w:cs="Times New Roman"/>
+                <w:sz w:val="24"/>
+                <w:szCs w:val="24"/>
+              </w:rPr>
+              <w:t>Appointments</w:t>
+            </w:r>
           </w:p>
         </w:tc>
         <w:tc>
@@ -2952,6 +3044,14 @@
                 <w:szCs w:val="24"/>
               </w:rPr>
             </w:pPr>
+            <w:r>
+              <w:rPr>
+                <w:rFonts w:ascii="Times New Roman" w:hAnsi="Times New Roman" w:cs="Times New Roman"/>
+                <w:sz w:val="24"/>
+                <w:szCs w:val="24"/>
+              </w:rPr>
+              <w:t>24</w:t>
+            </w:r>
           </w:p>
         </w:tc>
       </w:tr>
@@ -2974,6 +3074,38 @@
                 <w:szCs w:val="24"/>
               </w:rPr>
             </w:pPr>
+            <w:r>
+              <w:rPr>
+                <w:rFonts w:ascii="Times New Roman" w:hAnsi="Times New Roman" w:cs="Times New Roman"/>
+                <w:sz w:val="24"/>
+                <w:szCs w:val="24"/>
+              </w:rPr>
+              <w:t>3.</w:t>
+            </w:r>
+            <w:r>
+              <w:rPr>
+                <w:rFonts w:ascii="Times New Roman" w:hAnsi="Times New Roman" w:cs="Times New Roman"/>
+                <w:sz w:val="24"/>
+                <w:szCs w:val="24"/>
+              </w:rPr>
+              <w:t>2</w:t>
+            </w:r>
+            <w:r>
+              <w:rPr>
+                <w:rFonts w:ascii="Times New Roman" w:hAnsi="Times New Roman" w:cs="Times New Roman"/>
+                <w:sz w:val="24"/>
+                <w:szCs w:val="24"/>
+              </w:rPr>
+              <w:t>.</w:t>
+            </w:r>
+            <w:r>
+              <w:rPr>
+                <w:rFonts w:ascii="Times New Roman" w:hAnsi="Times New Roman" w:cs="Times New Roman"/>
+                <w:sz w:val="24"/>
+                <w:szCs w:val="24"/>
+              </w:rPr>
+              <w:t>1.5</w:t>
+            </w:r>
           </w:p>
         </w:tc>
         <w:tc>
@@ -2993,6 +3125,14 @@
                 <w:szCs w:val="24"/>
               </w:rPr>
             </w:pPr>
+            <w:r>
+              <w:rPr>
+                <w:rFonts w:ascii="Times New Roman" w:hAnsi="Times New Roman" w:cs="Times New Roman"/>
+                <w:sz w:val="24"/>
+                <w:szCs w:val="24"/>
+              </w:rPr>
+              <w:t>IPD Admissions</w:t>
+            </w:r>
           </w:p>
         </w:tc>
         <w:tc>
@@ -3013,6 +3153,1249 @@
                 <w:szCs w:val="24"/>
               </w:rPr>
             </w:pPr>
+            <w:r>
+              <w:rPr>
+                <w:rFonts w:ascii="Times New Roman" w:hAnsi="Times New Roman" w:cs="Times New Roman"/>
+                <w:sz w:val="24"/>
+                <w:szCs w:val="24"/>
+              </w:rPr>
+              <w:t>24</w:t>
+            </w:r>
+          </w:p>
+        </w:tc>
+      </w:tr>
+      <w:tr>
+        <w:tc>
+          <w:tcPr>
+            <w:tcW w:w="1628" w:type="dxa"/>
+            <w:tcMar>
+              <w:left w:w="108" w:type="dxa"/>
+            </w:tcMar>
+            <w:vAlign w:val="center"/>
+          </w:tcPr>
+          <w:p>
+            <w:pPr>
+              <w:spacing w:after="0" w:line="360" w:lineRule="auto"/>
+              <w:jc w:val="center"/>
+              <w:rPr>
+                <w:rFonts w:ascii="Times New Roman" w:hAnsi="Times New Roman" w:cs="Times New Roman"/>
+                <w:sz w:val="24"/>
+                <w:szCs w:val="24"/>
+              </w:rPr>
+            </w:pPr>
+            <w:r>
+              <w:rPr>
+                <w:rFonts w:ascii="Times New Roman" w:hAnsi="Times New Roman" w:cs="Times New Roman"/>
+                <w:sz w:val="24"/>
+                <w:szCs w:val="24"/>
+              </w:rPr>
+              <w:t>3.</w:t>
+            </w:r>
+            <w:r>
+              <w:rPr>
+                <w:rFonts w:ascii="Times New Roman" w:hAnsi="Times New Roman" w:cs="Times New Roman"/>
+                <w:sz w:val="24"/>
+                <w:szCs w:val="24"/>
+              </w:rPr>
+              <w:t>2</w:t>
+            </w:r>
+            <w:r>
+              <w:rPr>
+                <w:rFonts w:ascii="Times New Roman" w:hAnsi="Times New Roman" w:cs="Times New Roman"/>
+                <w:sz w:val="24"/>
+                <w:szCs w:val="24"/>
+              </w:rPr>
+              <w:t>.</w:t>
+            </w:r>
+            <w:r>
+              <w:rPr>
+                <w:rFonts w:ascii="Times New Roman" w:hAnsi="Times New Roman" w:cs="Times New Roman"/>
+                <w:sz w:val="24"/>
+                <w:szCs w:val="24"/>
+              </w:rPr>
+              <w:t>1.6</w:t>
+            </w:r>
+          </w:p>
+        </w:tc>
+        <w:tc>
+          <w:tcPr>
+            <w:tcW w:w="5951" w:type="dxa"/>
+            <w:tcMar>
+              <w:left w:w="108" w:type="dxa"/>
+            </w:tcMar>
+            <w:vAlign w:val="center"/>
+          </w:tcPr>
+          <w:p>
+            <w:pPr>
+              <w:spacing w:after="0" w:line="360" w:lineRule="auto"/>
+              <w:rPr>
+                <w:rFonts w:ascii="Times New Roman" w:hAnsi="Times New Roman" w:cs="Times New Roman"/>
+                <w:sz w:val="24"/>
+                <w:szCs w:val="24"/>
+              </w:rPr>
+            </w:pPr>
+            <w:r>
+              <w:rPr>
+                <w:rFonts w:ascii="Times New Roman" w:hAnsi="Times New Roman" w:cs="Times New Roman"/>
+                <w:sz w:val="24"/>
+                <w:szCs w:val="24"/>
+              </w:rPr>
+              <w:t>Rooms</w:t>
+            </w:r>
+          </w:p>
+        </w:tc>
+        <w:tc>
+          <w:tcPr>
+            <w:tcW w:w="1447" w:type="dxa"/>
+            <w:tcMar>
+              <w:left w:w="108" w:type="dxa"/>
+            </w:tcMar>
+            <w:vAlign w:val="center"/>
+          </w:tcPr>
+          <w:p>
+            <w:pPr>
+              <w:spacing w:after="0" w:line="360" w:lineRule="auto"/>
+              <w:jc w:val="center"/>
+              <w:rPr>
+                <w:rFonts w:ascii="Times New Roman" w:hAnsi="Times New Roman" w:cs="Times New Roman"/>
+                <w:sz w:val="24"/>
+                <w:szCs w:val="24"/>
+              </w:rPr>
+            </w:pPr>
+            <w:r>
+              <w:rPr>
+                <w:rFonts w:ascii="Times New Roman" w:hAnsi="Times New Roman" w:cs="Times New Roman"/>
+                <w:sz w:val="24"/>
+                <w:szCs w:val="24"/>
+              </w:rPr>
+              <w:t>25</w:t>
+            </w:r>
+          </w:p>
+        </w:tc>
+      </w:tr>
+      <w:tr>
+        <w:tc>
+          <w:tcPr>
+            <w:tcW w:w="1628" w:type="dxa"/>
+            <w:tcMar>
+              <w:left w:w="108" w:type="dxa"/>
+            </w:tcMar>
+            <w:vAlign w:val="center"/>
+          </w:tcPr>
+          <w:p>
+            <w:pPr>
+              <w:spacing w:after="0" w:line="360" w:lineRule="auto"/>
+              <w:jc w:val="center"/>
+              <w:rPr>
+                <w:rFonts w:ascii="Times New Roman" w:hAnsi="Times New Roman" w:cs="Times New Roman"/>
+                <w:sz w:val="24"/>
+                <w:szCs w:val="24"/>
+              </w:rPr>
+            </w:pPr>
+            <w:r>
+              <w:rPr>
+                <w:rFonts w:ascii="Times New Roman" w:hAnsi="Times New Roman" w:cs="Times New Roman"/>
+                <w:sz w:val="24"/>
+                <w:szCs w:val="24"/>
+              </w:rPr>
+              <w:t>3.</w:t>
+            </w:r>
+            <w:r>
+              <w:rPr>
+                <w:rFonts w:ascii="Times New Roman" w:hAnsi="Times New Roman" w:cs="Times New Roman"/>
+                <w:sz w:val="24"/>
+                <w:szCs w:val="24"/>
+              </w:rPr>
+              <w:t>2</w:t>
+            </w:r>
+            <w:r>
+              <w:rPr>
+                <w:rFonts w:ascii="Times New Roman" w:hAnsi="Times New Roman" w:cs="Times New Roman"/>
+                <w:sz w:val="24"/>
+                <w:szCs w:val="24"/>
+              </w:rPr>
+              <w:t>.</w:t>
+            </w:r>
+            <w:r>
+              <w:rPr>
+                <w:rFonts w:ascii="Times New Roman" w:hAnsi="Times New Roman" w:cs="Times New Roman"/>
+                <w:sz w:val="24"/>
+                <w:szCs w:val="24"/>
+              </w:rPr>
+              <w:t>1.7</w:t>
+            </w:r>
+          </w:p>
+        </w:tc>
+        <w:tc>
+          <w:tcPr>
+            <w:tcW w:w="5951" w:type="dxa"/>
+            <w:tcMar>
+              <w:left w:w="108" w:type="dxa"/>
+            </w:tcMar>
+            <w:vAlign w:val="center"/>
+          </w:tcPr>
+          <w:p>
+            <w:pPr>
+              <w:spacing w:after="0" w:line="360" w:lineRule="auto"/>
+              <w:rPr>
+                <w:rFonts w:ascii="Times New Roman" w:hAnsi="Times New Roman" w:cs="Times New Roman"/>
+                <w:sz w:val="24"/>
+                <w:szCs w:val="24"/>
+              </w:rPr>
+            </w:pPr>
+            <w:r>
+              <w:rPr>
+                <w:rFonts w:ascii="Times New Roman" w:hAnsi="Times New Roman" w:cs="Times New Roman"/>
+                <w:sz w:val="24"/>
+                <w:szCs w:val="24"/>
+              </w:rPr>
+              <w:t>Vitals</w:t>
+            </w:r>
+          </w:p>
+        </w:tc>
+        <w:tc>
+          <w:tcPr>
+            <w:tcW w:w="1447" w:type="dxa"/>
+            <w:tcMar>
+              <w:left w:w="108" w:type="dxa"/>
+            </w:tcMar>
+            <w:vAlign w:val="center"/>
+          </w:tcPr>
+          <w:p>
+            <w:pPr>
+              <w:spacing w:after="0" w:line="360" w:lineRule="auto"/>
+              <w:jc w:val="center"/>
+              <w:rPr>
+                <w:rFonts w:ascii="Times New Roman" w:hAnsi="Times New Roman" w:cs="Times New Roman"/>
+                <w:sz w:val="24"/>
+                <w:szCs w:val="24"/>
+              </w:rPr>
+            </w:pPr>
+            <w:r>
+              <w:rPr>
+                <w:rFonts w:ascii="Times New Roman" w:hAnsi="Times New Roman" w:cs="Times New Roman"/>
+                <w:sz w:val="24"/>
+                <w:szCs w:val="24"/>
+              </w:rPr>
+              <w:t>25</w:t>
+            </w:r>
+          </w:p>
+        </w:tc>
+      </w:tr>
+      <w:tr>
+        <w:tc>
+          <w:tcPr>
+            <w:tcW w:w="1628" w:type="dxa"/>
+            <w:tcMar>
+              <w:left w:w="108" w:type="dxa"/>
+            </w:tcMar>
+            <w:vAlign w:val="center"/>
+          </w:tcPr>
+          <w:p>
+            <w:pPr>
+              <w:spacing w:after="0" w:line="360" w:lineRule="auto"/>
+              <w:jc w:val="center"/>
+              <w:rPr>
+                <w:rFonts w:ascii="Times New Roman" w:hAnsi="Times New Roman" w:cs="Times New Roman"/>
+                <w:sz w:val="24"/>
+                <w:szCs w:val="24"/>
+              </w:rPr>
+            </w:pPr>
+            <w:r>
+              <w:rPr>
+                <w:rFonts w:ascii="Times New Roman" w:hAnsi="Times New Roman" w:cs="Times New Roman"/>
+                <w:sz w:val="24"/>
+                <w:szCs w:val="24"/>
+              </w:rPr>
+              <w:t>3.</w:t>
+            </w:r>
+            <w:r>
+              <w:rPr>
+                <w:rFonts w:ascii="Times New Roman" w:hAnsi="Times New Roman" w:cs="Times New Roman"/>
+                <w:sz w:val="24"/>
+                <w:szCs w:val="24"/>
+              </w:rPr>
+              <w:t>2</w:t>
+            </w:r>
+            <w:r>
+              <w:rPr>
+                <w:rFonts w:ascii="Times New Roman" w:hAnsi="Times New Roman" w:cs="Times New Roman"/>
+                <w:sz w:val="24"/>
+                <w:szCs w:val="24"/>
+              </w:rPr>
+              <w:t>.</w:t>
+            </w:r>
+            <w:r>
+              <w:rPr>
+                <w:rFonts w:ascii="Times New Roman" w:hAnsi="Times New Roman" w:cs="Times New Roman"/>
+                <w:sz w:val="24"/>
+                <w:szCs w:val="24"/>
+              </w:rPr>
+              <w:t>1.8</w:t>
+            </w:r>
+          </w:p>
+        </w:tc>
+        <w:tc>
+          <w:tcPr>
+            <w:tcW w:w="5951" w:type="dxa"/>
+            <w:tcMar>
+              <w:left w:w="108" w:type="dxa"/>
+            </w:tcMar>
+            <w:vAlign w:val="center"/>
+          </w:tcPr>
+          <w:p>
+            <w:pPr>
+              <w:spacing w:after="0" w:line="360" w:lineRule="auto"/>
+              <w:rPr>
+                <w:rFonts w:ascii="Times New Roman" w:hAnsi="Times New Roman" w:cs="Times New Roman"/>
+                <w:sz w:val="24"/>
+                <w:szCs w:val="24"/>
+              </w:rPr>
+            </w:pPr>
+            <w:r>
+              <w:rPr>
+                <w:rFonts w:ascii="Times New Roman" w:hAnsi="Times New Roman" w:cs="Times New Roman"/>
+                <w:sz w:val="24"/>
+                <w:szCs w:val="24"/>
+              </w:rPr>
+              <w:t xml:space="preserve">OPD </w:t>
+            </w:r>
+            <w:proofErr w:type="spellStart"/>
+            <w:r>
+              <w:rPr>
+                <w:rFonts w:ascii="Times New Roman" w:hAnsi="Times New Roman" w:cs="Times New Roman"/>
+                <w:sz w:val="24"/>
+                <w:szCs w:val="24"/>
+              </w:rPr>
+              <w:t>Counsultations</w:t>
+            </w:r>
+            <w:proofErr w:type="spellEnd"/>
+          </w:p>
+        </w:tc>
+        <w:tc>
+          <w:tcPr>
+            <w:tcW w:w="1447" w:type="dxa"/>
+            <w:tcMar>
+              <w:left w:w="108" w:type="dxa"/>
+            </w:tcMar>
+            <w:vAlign w:val="center"/>
+          </w:tcPr>
+          <w:p>
+            <w:pPr>
+              <w:spacing w:after="0" w:line="360" w:lineRule="auto"/>
+              <w:jc w:val="center"/>
+              <w:rPr>
+                <w:rFonts w:ascii="Times New Roman" w:hAnsi="Times New Roman" w:cs="Times New Roman"/>
+                <w:sz w:val="24"/>
+                <w:szCs w:val="24"/>
+              </w:rPr>
+            </w:pPr>
+            <w:r>
+              <w:rPr>
+                <w:rFonts w:ascii="Times New Roman" w:hAnsi="Times New Roman" w:cs="Times New Roman"/>
+                <w:sz w:val="24"/>
+                <w:szCs w:val="24"/>
+              </w:rPr>
+              <w:t>25</w:t>
+            </w:r>
+          </w:p>
+        </w:tc>
+      </w:tr>
+      <w:tr>
+        <w:tc>
+          <w:tcPr>
+            <w:tcW w:w="1628" w:type="dxa"/>
+            <w:tcMar>
+              <w:left w:w="108" w:type="dxa"/>
+            </w:tcMar>
+            <w:vAlign w:val="center"/>
+          </w:tcPr>
+          <w:p>
+            <w:pPr>
+              <w:spacing w:after="0" w:line="360" w:lineRule="auto"/>
+              <w:jc w:val="center"/>
+              <w:rPr>
+                <w:rFonts w:ascii="Times New Roman" w:hAnsi="Times New Roman" w:cs="Times New Roman"/>
+                <w:sz w:val="24"/>
+                <w:szCs w:val="24"/>
+              </w:rPr>
+            </w:pPr>
+            <w:r>
+              <w:rPr>
+                <w:rFonts w:ascii="Times New Roman" w:hAnsi="Times New Roman" w:cs="Times New Roman"/>
+                <w:sz w:val="24"/>
+                <w:szCs w:val="24"/>
+              </w:rPr>
+              <w:t>3.</w:t>
+            </w:r>
+            <w:r>
+              <w:rPr>
+                <w:rFonts w:ascii="Times New Roman" w:hAnsi="Times New Roman" w:cs="Times New Roman"/>
+                <w:sz w:val="24"/>
+                <w:szCs w:val="24"/>
+              </w:rPr>
+              <w:t>2</w:t>
+            </w:r>
+            <w:r>
+              <w:rPr>
+                <w:rFonts w:ascii="Times New Roman" w:hAnsi="Times New Roman" w:cs="Times New Roman"/>
+                <w:sz w:val="24"/>
+                <w:szCs w:val="24"/>
+              </w:rPr>
+              <w:t>.</w:t>
+            </w:r>
+            <w:r>
+              <w:rPr>
+                <w:rFonts w:ascii="Times New Roman" w:hAnsi="Times New Roman" w:cs="Times New Roman"/>
+                <w:sz w:val="24"/>
+                <w:szCs w:val="24"/>
+              </w:rPr>
+              <w:t>1.9</w:t>
+            </w:r>
+          </w:p>
+        </w:tc>
+        <w:tc>
+          <w:tcPr>
+            <w:tcW w:w="5951" w:type="dxa"/>
+            <w:tcMar>
+              <w:left w:w="108" w:type="dxa"/>
+            </w:tcMar>
+            <w:vAlign w:val="center"/>
+          </w:tcPr>
+          <w:p>
+            <w:pPr>
+              <w:spacing w:after="0" w:line="360" w:lineRule="auto"/>
+              <w:rPr>
+                <w:rFonts w:ascii="Times New Roman" w:hAnsi="Times New Roman" w:cs="Times New Roman"/>
+                <w:sz w:val="24"/>
+                <w:szCs w:val="24"/>
+              </w:rPr>
+            </w:pPr>
+            <w:r>
+              <w:rPr>
+                <w:rFonts w:ascii="Times New Roman" w:hAnsi="Times New Roman" w:cs="Times New Roman"/>
+                <w:sz w:val="24"/>
+                <w:szCs w:val="24"/>
+              </w:rPr>
+              <w:t>IPD Rounds</w:t>
+            </w:r>
+          </w:p>
+        </w:tc>
+        <w:tc>
+          <w:tcPr>
+            <w:tcW w:w="1447" w:type="dxa"/>
+            <w:tcMar>
+              <w:left w:w="108" w:type="dxa"/>
+            </w:tcMar>
+            <w:vAlign w:val="center"/>
+          </w:tcPr>
+          <w:p>
+            <w:pPr>
+              <w:spacing w:after="0" w:line="360" w:lineRule="auto"/>
+              <w:jc w:val="center"/>
+              <w:rPr>
+                <w:rFonts w:ascii="Times New Roman" w:hAnsi="Times New Roman" w:cs="Times New Roman"/>
+                <w:sz w:val="24"/>
+                <w:szCs w:val="24"/>
+              </w:rPr>
+            </w:pPr>
+            <w:r>
+              <w:rPr>
+                <w:rFonts w:ascii="Times New Roman" w:hAnsi="Times New Roman" w:cs="Times New Roman"/>
+                <w:sz w:val="24"/>
+                <w:szCs w:val="24"/>
+              </w:rPr>
+              <w:t>26</w:t>
+            </w:r>
+          </w:p>
+        </w:tc>
+      </w:tr>
+      <w:tr>
+        <w:tc>
+          <w:tcPr>
+            <w:tcW w:w="1628" w:type="dxa"/>
+            <w:tcMar>
+              <w:left w:w="108" w:type="dxa"/>
+            </w:tcMar>
+            <w:vAlign w:val="center"/>
+          </w:tcPr>
+          <w:p>
+            <w:pPr>
+              <w:spacing w:after="0" w:line="360" w:lineRule="auto"/>
+              <w:jc w:val="center"/>
+              <w:rPr>
+                <w:rFonts w:ascii="Times New Roman" w:hAnsi="Times New Roman" w:cs="Times New Roman"/>
+                <w:sz w:val="24"/>
+                <w:szCs w:val="24"/>
+              </w:rPr>
+            </w:pPr>
+            <w:r>
+              <w:rPr>
+                <w:rFonts w:ascii="Times New Roman" w:hAnsi="Times New Roman" w:cs="Times New Roman"/>
+                <w:sz w:val="24"/>
+                <w:szCs w:val="24"/>
+              </w:rPr>
+              <w:t>3.</w:t>
+            </w:r>
+            <w:r>
+              <w:rPr>
+                <w:rFonts w:ascii="Times New Roman" w:hAnsi="Times New Roman" w:cs="Times New Roman"/>
+                <w:sz w:val="24"/>
+                <w:szCs w:val="24"/>
+              </w:rPr>
+              <w:t>2</w:t>
+            </w:r>
+            <w:r>
+              <w:rPr>
+                <w:rFonts w:ascii="Times New Roman" w:hAnsi="Times New Roman" w:cs="Times New Roman"/>
+                <w:sz w:val="24"/>
+                <w:szCs w:val="24"/>
+              </w:rPr>
+              <w:t>.</w:t>
+            </w:r>
+            <w:r>
+              <w:rPr>
+                <w:rFonts w:ascii="Times New Roman" w:hAnsi="Times New Roman" w:cs="Times New Roman"/>
+                <w:sz w:val="24"/>
+                <w:szCs w:val="24"/>
+              </w:rPr>
+              <w:t>1.10</w:t>
+            </w:r>
+          </w:p>
+        </w:tc>
+        <w:tc>
+          <w:tcPr>
+            <w:tcW w:w="5951" w:type="dxa"/>
+            <w:tcMar>
+              <w:left w:w="108" w:type="dxa"/>
+            </w:tcMar>
+            <w:vAlign w:val="center"/>
+          </w:tcPr>
+          <w:p>
+            <w:pPr>
+              <w:spacing w:after="0" w:line="360" w:lineRule="auto"/>
+              <w:rPr>
+                <w:rFonts w:ascii="Times New Roman" w:hAnsi="Times New Roman" w:cs="Times New Roman"/>
+                <w:sz w:val="24"/>
+                <w:szCs w:val="24"/>
+              </w:rPr>
+            </w:pPr>
+            <w:r>
+              <w:rPr>
+                <w:rFonts w:ascii="Times New Roman" w:hAnsi="Times New Roman" w:cs="Times New Roman"/>
+                <w:sz w:val="24"/>
+                <w:szCs w:val="24"/>
+              </w:rPr>
+              <w:t>Doctor Notes</w:t>
+            </w:r>
+          </w:p>
+        </w:tc>
+        <w:tc>
+          <w:tcPr>
+            <w:tcW w:w="1447" w:type="dxa"/>
+            <w:tcMar>
+              <w:left w:w="108" w:type="dxa"/>
+            </w:tcMar>
+            <w:vAlign w:val="center"/>
+          </w:tcPr>
+          <w:p>
+            <w:pPr>
+              <w:spacing w:after="0" w:line="360" w:lineRule="auto"/>
+              <w:jc w:val="center"/>
+              <w:rPr>
+                <w:rFonts w:ascii="Times New Roman" w:hAnsi="Times New Roman" w:cs="Times New Roman"/>
+                <w:sz w:val="24"/>
+                <w:szCs w:val="24"/>
+              </w:rPr>
+            </w:pPr>
+            <w:r>
+              <w:rPr>
+                <w:rFonts w:ascii="Times New Roman" w:hAnsi="Times New Roman" w:cs="Times New Roman"/>
+                <w:sz w:val="24"/>
+                <w:szCs w:val="24"/>
+              </w:rPr>
+              <w:t>26</w:t>
+            </w:r>
+          </w:p>
+        </w:tc>
+      </w:tr>
+      <w:tr>
+        <w:tc>
+          <w:tcPr>
+            <w:tcW w:w="1628" w:type="dxa"/>
+            <w:tcMar>
+              <w:left w:w="108" w:type="dxa"/>
+            </w:tcMar>
+            <w:vAlign w:val="center"/>
+          </w:tcPr>
+          <w:p>
+            <w:pPr>
+              <w:spacing w:after="0" w:line="360" w:lineRule="auto"/>
+              <w:jc w:val="center"/>
+              <w:rPr>
+                <w:rFonts w:ascii="Times New Roman" w:hAnsi="Times New Roman" w:cs="Times New Roman"/>
+                <w:sz w:val="24"/>
+                <w:szCs w:val="24"/>
+              </w:rPr>
+            </w:pPr>
+            <w:r>
+              <w:rPr>
+                <w:rFonts w:ascii="Times New Roman" w:hAnsi="Times New Roman" w:cs="Times New Roman"/>
+                <w:sz w:val="24"/>
+                <w:szCs w:val="24"/>
+              </w:rPr>
+              <w:t>3.</w:t>
+            </w:r>
+            <w:r>
+              <w:rPr>
+                <w:rFonts w:ascii="Times New Roman" w:hAnsi="Times New Roman" w:cs="Times New Roman"/>
+                <w:sz w:val="24"/>
+                <w:szCs w:val="24"/>
+              </w:rPr>
+              <w:t>2</w:t>
+            </w:r>
+            <w:r>
+              <w:rPr>
+                <w:rFonts w:ascii="Times New Roman" w:hAnsi="Times New Roman" w:cs="Times New Roman"/>
+                <w:sz w:val="24"/>
+                <w:szCs w:val="24"/>
+              </w:rPr>
+              <w:t>.</w:t>
+            </w:r>
+            <w:r>
+              <w:rPr>
+                <w:rFonts w:ascii="Times New Roman" w:hAnsi="Times New Roman" w:cs="Times New Roman"/>
+                <w:sz w:val="24"/>
+                <w:szCs w:val="24"/>
+              </w:rPr>
+              <w:t>1.11</w:t>
+            </w:r>
+          </w:p>
+        </w:tc>
+        <w:tc>
+          <w:tcPr>
+            <w:tcW w:w="5951" w:type="dxa"/>
+            <w:tcMar>
+              <w:left w:w="108" w:type="dxa"/>
+            </w:tcMar>
+            <w:vAlign w:val="center"/>
+          </w:tcPr>
+          <w:p>
+            <w:pPr>
+              <w:spacing w:after="0" w:line="360" w:lineRule="auto"/>
+              <w:rPr>
+                <w:rFonts w:ascii="Times New Roman" w:hAnsi="Times New Roman" w:cs="Times New Roman"/>
+                <w:sz w:val="24"/>
+                <w:szCs w:val="24"/>
+              </w:rPr>
+            </w:pPr>
+            <w:r>
+              <w:rPr>
+                <w:rFonts w:ascii="Times New Roman" w:hAnsi="Times New Roman" w:cs="Times New Roman"/>
+                <w:sz w:val="24"/>
+                <w:szCs w:val="24"/>
+              </w:rPr>
+              <w:t>Lab Test Master</w:t>
+            </w:r>
+          </w:p>
+        </w:tc>
+        <w:tc>
+          <w:tcPr>
+            <w:tcW w:w="1447" w:type="dxa"/>
+            <w:tcMar>
+              <w:left w:w="108" w:type="dxa"/>
+            </w:tcMar>
+            <w:vAlign w:val="center"/>
+          </w:tcPr>
+          <w:p>
+            <w:pPr>
+              <w:spacing w:after="0" w:line="360" w:lineRule="auto"/>
+              <w:jc w:val="center"/>
+              <w:rPr>
+                <w:rFonts w:ascii="Times New Roman" w:hAnsi="Times New Roman" w:cs="Times New Roman"/>
+                <w:sz w:val="24"/>
+                <w:szCs w:val="24"/>
+              </w:rPr>
+            </w:pPr>
+            <w:r>
+              <w:rPr>
+                <w:rFonts w:ascii="Times New Roman" w:hAnsi="Times New Roman" w:cs="Times New Roman"/>
+                <w:sz w:val="24"/>
+                <w:szCs w:val="24"/>
+              </w:rPr>
+              <w:t>27</w:t>
+            </w:r>
+          </w:p>
+        </w:tc>
+      </w:tr>
+      <w:tr>
+        <w:tc>
+          <w:tcPr>
+            <w:tcW w:w="1628" w:type="dxa"/>
+            <w:tcMar>
+              <w:left w:w="108" w:type="dxa"/>
+            </w:tcMar>
+            <w:vAlign w:val="center"/>
+          </w:tcPr>
+          <w:p>
+            <w:pPr>
+              <w:spacing w:after="0" w:line="360" w:lineRule="auto"/>
+              <w:jc w:val="center"/>
+              <w:rPr>
+                <w:rFonts w:ascii="Times New Roman" w:hAnsi="Times New Roman" w:cs="Times New Roman"/>
+                <w:sz w:val="24"/>
+                <w:szCs w:val="24"/>
+              </w:rPr>
+            </w:pPr>
+            <w:r>
+              <w:rPr>
+                <w:rFonts w:ascii="Times New Roman" w:hAnsi="Times New Roman" w:cs="Times New Roman"/>
+                <w:sz w:val="24"/>
+                <w:szCs w:val="24"/>
+              </w:rPr>
+              <w:t>3.</w:t>
+            </w:r>
+            <w:r>
+              <w:rPr>
+                <w:rFonts w:ascii="Times New Roman" w:hAnsi="Times New Roman" w:cs="Times New Roman"/>
+                <w:sz w:val="24"/>
+                <w:szCs w:val="24"/>
+              </w:rPr>
+              <w:t>2</w:t>
+            </w:r>
+            <w:r>
+              <w:rPr>
+                <w:rFonts w:ascii="Times New Roman" w:hAnsi="Times New Roman" w:cs="Times New Roman"/>
+                <w:sz w:val="24"/>
+                <w:szCs w:val="24"/>
+              </w:rPr>
+              <w:t>.</w:t>
+            </w:r>
+            <w:r>
+              <w:rPr>
+                <w:rFonts w:ascii="Times New Roman" w:hAnsi="Times New Roman" w:cs="Times New Roman"/>
+                <w:sz w:val="24"/>
+                <w:szCs w:val="24"/>
+              </w:rPr>
+              <w:t>1.12</w:t>
+            </w:r>
+          </w:p>
+        </w:tc>
+        <w:tc>
+          <w:tcPr>
+            <w:tcW w:w="5951" w:type="dxa"/>
+            <w:tcMar>
+              <w:left w:w="108" w:type="dxa"/>
+            </w:tcMar>
+            <w:vAlign w:val="center"/>
+          </w:tcPr>
+          <w:p>
+            <w:pPr>
+              <w:spacing w:after="0" w:line="360" w:lineRule="auto"/>
+              <w:rPr>
+                <w:rFonts w:ascii="Times New Roman" w:hAnsi="Times New Roman" w:cs="Times New Roman"/>
+                <w:sz w:val="24"/>
+                <w:szCs w:val="24"/>
+              </w:rPr>
+            </w:pPr>
+            <w:r>
+              <w:rPr>
+                <w:rFonts w:ascii="Times New Roman" w:hAnsi="Times New Roman" w:cs="Times New Roman"/>
+                <w:sz w:val="24"/>
+                <w:szCs w:val="24"/>
+              </w:rPr>
+              <w:t>Lab Active Order</w:t>
+            </w:r>
+          </w:p>
+        </w:tc>
+        <w:tc>
+          <w:tcPr>
+            <w:tcW w:w="1447" w:type="dxa"/>
+            <w:tcMar>
+              <w:left w:w="108" w:type="dxa"/>
+            </w:tcMar>
+            <w:vAlign w:val="center"/>
+          </w:tcPr>
+          <w:p>
+            <w:pPr>
+              <w:spacing w:after="0" w:line="360" w:lineRule="auto"/>
+              <w:jc w:val="center"/>
+              <w:rPr>
+                <w:rFonts w:ascii="Times New Roman" w:hAnsi="Times New Roman" w:cs="Times New Roman"/>
+                <w:sz w:val="24"/>
+                <w:szCs w:val="24"/>
+              </w:rPr>
+            </w:pPr>
+            <w:r>
+              <w:rPr>
+                <w:rFonts w:ascii="Times New Roman" w:hAnsi="Times New Roman" w:cs="Times New Roman"/>
+                <w:sz w:val="24"/>
+                <w:szCs w:val="24"/>
+              </w:rPr>
+              <w:t>27</w:t>
+            </w:r>
+          </w:p>
+        </w:tc>
+      </w:tr>
+      <w:tr>
+        <w:tc>
+          <w:tcPr>
+            <w:tcW w:w="1628" w:type="dxa"/>
+            <w:tcMar>
+              <w:left w:w="108" w:type="dxa"/>
+            </w:tcMar>
+            <w:vAlign w:val="center"/>
+          </w:tcPr>
+          <w:p>
+            <w:pPr>
+              <w:spacing w:after="0" w:line="360" w:lineRule="auto"/>
+              <w:jc w:val="center"/>
+              <w:rPr>
+                <w:rFonts w:ascii="Times New Roman" w:hAnsi="Times New Roman" w:cs="Times New Roman"/>
+                <w:sz w:val="24"/>
+                <w:szCs w:val="24"/>
+              </w:rPr>
+            </w:pPr>
+            <w:r>
+              <w:rPr>
+                <w:rFonts w:ascii="Times New Roman" w:hAnsi="Times New Roman" w:cs="Times New Roman"/>
+                <w:sz w:val="24"/>
+                <w:szCs w:val="24"/>
+              </w:rPr>
+              <w:t>3.</w:t>
+            </w:r>
+            <w:r>
+              <w:rPr>
+                <w:rFonts w:ascii="Times New Roman" w:hAnsi="Times New Roman" w:cs="Times New Roman"/>
+                <w:sz w:val="24"/>
+                <w:szCs w:val="24"/>
+              </w:rPr>
+              <w:t>2</w:t>
+            </w:r>
+            <w:r>
+              <w:rPr>
+                <w:rFonts w:ascii="Times New Roman" w:hAnsi="Times New Roman" w:cs="Times New Roman"/>
+                <w:sz w:val="24"/>
+                <w:szCs w:val="24"/>
+              </w:rPr>
+              <w:t>.</w:t>
+            </w:r>
+            <w:r>
+              <w:rPr>
+                <w:rFonts w:ascii="Times New Roman" w:hAnsi="Times New Roman" w:cs="Times New Roman"/>
+                <w:sz w:val="24"/>
+                <w:szCs w:val="24"/>
+              </w:rPr>
+              <w:t>1.13</w:t>
+            </w:r>
+          </w:p>
+        </w:tc>
+        <w:tc>
+          <w:tcPr>
+            <w:tcW w:w="5951" w:type="dxa"/>
+            <w:tcMar>
+              <w:left w:w="108" w:type="dxa"/>
+            </w:tcMar>
+            <w:vAlign w:val="center"/>
+          </w:tcPr>
+          <w:p>
+            <w:pPr>
+              <w:spacing w:after="0" w:line="360" w:lineRule="auto"/>
+              <w:rPr>
+                <w:rFonts w:ascii="Times New Roman" w:hAnsi="Times New Roman" w:cs="Times New Roman"/>
+                <w:sz w:val="24"/>
+                <w:szCs w:val="24"/>
+              </w:rPr>
+            </w:pPr>
+            <w:r>
+              <w:rPr>
+                <w:rFonts w:ascii="Times New Roman" w:hAnsi="Times New Roman" w:cs="Times New Roman"/>
+                <w:sz w:val="24"/>
+                <w:szCs w:val="24"/>
+              </w:rPr>
+              <w:t xml:space="preserve">Operation </w:t>
+            </w:r>
+            <w:proofErr w:type="spellStart"/>
+            <w:r>
+              <w:rPr>
+                <w:rFonts w:ascii="Times New Roman" w:hAnsi="Times New Roman" w:cs="Times New Roman"/>
+                <w:sz w:val="24"/>
+                <w:szCs w:val="24"/>
+              </w:rPr>
+              <w:t>Theaters</w:t>
+            </w:r>
+            <w:proofErr w:type="spellEnd"/>
+          </w:p>
+        </w:tc>
+        <w:tc>
+          <w:tcPr>
+            <w:tcW w:w="1447" w:type="dxa"/>
+            <w:tcMar>
+              <w:left w:w="108" w:type="dxa"/>
+            </w:tcMar>
+            <w:vAlign w:val="center"/>
+          </w:tcPr>
+          <w:p>
+            <w:pPr>
+              <w:spacing w:after="0" w:line="360" w:lineRule="auto"/>
+              <w:jc w:val="center"/>
+              <w:rPr>
+                <w:rFonts w:ascii="Times New Roman" w:hAnsi="Times New Roman" w:cs="Times New Roman"/>
+                <w:sz w:val="24"/>
+                <w:szCs w:val="24"/>
+              </w:rPr>
+            </w:pPr>
+            <w:r>
+              <w:rPr>
+                <w:rFonts w:ascii="Times New Roman" w:hAnsi="Times New Roman" w:cs="Times New Roman"/>
+                <w:sz w:val="24"/>
+                <w:szCs w:val="24"/>
+              </w:rPr>
+              <w:t>27</w:t>
+            </w:r>
+          </w:p>
+        </w:tc>
+      </w:tr>
+      <w:tr>
+        <w:tc>
+          <w:tcPr>
+            <w:tcW w:w="1628" w:type="dxa"/>
+            <w:tcMar>
+              <w:left w:w="108" w:type="dxa"/>
+            </w:tcMar>
+            <w:vAlign w:val="center"/>
+          </w:tcPr>
+          <w:p>
+            <w:pPr>
+              <w:spacing w:after="0" w:line="360" w:lineRule="auto"/>
+              <w:jc w:val="center"/>
+              <w:rPr>
+                <w:rFonts w:ascii="Times New Roman" w:hAnsi="Times New Roman" w:cs="Times New Roman"/>
+                <w:sz w:val="24"/>
+                <w:szCs w:val="24"/>
+              </w:rPr>
+            </w:pPr>
+            <w:r>
+              <w:rPr>
+                <w:rFonts w:ascii="Times New Roman" w:hAnsi="Times New Roman" w:cs="Times New Roman"/>
+                <w:sz w:val="24"/>
+                <w:szCs w:val="24"/>
+              </w:rPr>
+              <w:t>3.</w:t>
+            </w:r>
+            <w:r>
+              <w:rPr>
+                <w:rFonts w:ascii="Times New Roman" w:hAnsi="Times New Roman" w:cs="Times New Roman"/>
+                <w:sz w:val="24"/>
+                <w:szCs w:val="24"/>
+              </w:rPr>
+              <w:t>2</w:t>
+            </w:r>
+            <w:r>
+              <w:rPr>
+                <w:rFonts w:ascii="Times New Roman" w:hAnsi="Times New Roman" w:cs="Times New Roman"/>
+                <w:sz w:val="24"/>
+                <w:szCs w:val="24"/>
+              </w:rPr>
+              <w:t>.</w:t>
+            </w:r>
+            <w:r>
+              <w:rPr>
+                <w:rFonts w:ascii="Times New Roman" w:hAnsi="Times New Roman" w:cs="Times New Roman"/>
+                <w:sz w:val="24"/>
+                <w:szCs w:val="24"/>
+              </w:rPr>
+              <w:t>1.14</w:t>
+            </w:r>
+          </w:p>
+        </w:tc>
+        <w:tc>
+          <w:tcPr>
+            <w:tcW w:w="5951" w:type="dxa"/>
+            <w:tcMar>
+              <w:left w:w="108" w:type="dxa"/>
+            </w:tcMar>
+            <w:vAlign w:val="center"/>
+          </w:tcPr>
+          <w:p>
+            <w:pPr>
+              <w:spacing w:after="0" w:line="360" w:lineRule="auto"/>
+              <w:rPr>
+                <w:rFonts w:ascii="Times New Roman" w:hAnsi="Times New Roman" w:cs="Times New Roman"/>
+                <w:sz w:val="24"/>
+                <w:szCs w:val="24"/>
+              </w:rPr>
+            </w:pPr>
+            <w:r>
+              <w:rPr>
+                <w:rFonts w:ascii="Times New Roman" w:hAnsi="Times New Roman" w:cs="Times New Roman"/>
+                <w:sz w:val="24"/>
+                <w:szCs w:val="24"/>
+              </w:rPr>
+              <w:t>Surgery Schedules</w:t>
+            </w:r>
+          </w:p>
+        </w:tc>
+        <w:tc>
+          <w:tcPr>
+            <w:tcW w:w="1447" w:type="dxa"/>
+            <w:tcMar>
+              <w:left w:w="108" w:type="dxa"/>
+            </w:tcMar>
+            <w:vAlign w:val="center"/>
+          </w:tcPr>
+          <w:p>
+            <w:pPr>
+              <w:spacing w:after="0" w:line="360" w:lineRule="auto"/>
+              <w:jc w:val="center"/>
+              <w:rPr>
+                <w:rFonts w:ascii="Times New Roman" w:hAnsi="Times New Roman" w:cs="Times New Roman"/>
+                <w:sz w:val="24"/>
+                <w:szCs w:val="24"/>
+              </w:rPr>
+            </w:pPr>
+            <w:r>
+              <w:rPr>
+                <w:rFonts w:ascii="Times New Roman" w:hAnsi="Times New Roman" w:cs="Times New Roman"/>
+                <w:sz w:val="24"/>
+                <w:szCs w:val="24"/>
+              </w:rPr>
+              <w:t>28</w:t>
+            </w:r>
+          </w:p>
+        </w:tc>
+      </w:tr>
+      <w:tr>
+        <w:tc>
+          <w:tcPr>
+            <w:tcW w:w="1628" w:type="dxa"/>
+            <w:tcMar>
+              <w:left w:w="108" w:type="dxa"/>
+            </w:tcMar>
+            <w:vAlign w:val="center"/>
+          </w:tcPr>
+          <w:p>
+            <w:pPr>
+              <w:spacing w:after="0" w:line="360" w:lineRule="auto"/>
+              <w:jc w:val="center"/>
+              <w:rPr>
+                <w:rFonts w:ascii="Times New Roman" w:hAnsi="Times New Roman" w:cs="Times New Roman"/>
+                <w:sz w:val="24"/>
+                <w:szCs w:val="24"/>
+              </w:rPr>
+            </w:pPr>
+            <w:r>
+              <w:rPr>
+                <w:rFonts w:ascii="Times New Roman" w:hAnsi="Times New Roman" w:cs="Times New Roman"/>
+                <w:sz w:val="24"/>
+                <w:szCs w:val="24"/>
+              </w:rPr>
+              <w:t>3.</w:t>
+            </w:r>
+            <w:r>
+              <w:rPr>
+                <w:rFonts w:ascii="Times New Roman" w:hAnsi="Times New Roman" w:cs="Times New Roman"/>
+                <w:sz w:val="24"/>
+                <w:szCs w:val="24"/>
+              </w:rPr>
+              <w:t>2</w:t>
+            </w:r>
+            <w:r>
+              <w:rPr>
+                <w:rFonts w:ascii="Times New Roman" w:hAnsi="Times New Roman" w:cs="Times New Roman"/>
+                <w:sz w:val="24"/>
+                <w:szCs w:val="24"/>
+              </w:rPr>
+              <w:t>.</w:t>
+            </w:r>
+            <w:r>
+              <w:rPr>
+                <w:rFonts w:ascii="Times New Roman" w:hAnsi="Times New Roman" w:cs="Times New Roman"/>
+                <w:sz w:val="24"/>
+                <w:szCs w:val="24"/>
+              </w:rPr>
+              <w:t>1.1</w:t>
+            </w:r>
+            <w:r>
+              <w:rPr>
+                <w:rFonts w:ascii="Times New Roman" w:hAnsi="Times New Roman" w:cs="Times New Roman"/>
+                <w:sz w:val="24"/>
+                <w:szCs w:val="24"/>
+              </w:rPr>
+              <w:t>5</w:t>
+            </w:r>
+          </w:p>
+        </w:tc>
+        <w:tc>
+          <w:tcPr>
+            <w:tcW w:w="5951" w:type="dxa"/>
+            <w:tcMar>
+              <w:left w:w="108" w:type="dxa"/>
+            </w:tcMar>
+            <w:vAlign w:val="center"/>
+          </w:tcPr>
+          <w:p>
+            <w:pPr>
+              <w:spacing w:after="0" w:line="360" w:lineRule="auto"/>
+              <w:rPr>
+                <w:rFonts w:ascii="Times New Roman" w:hAnsi="Times New Roman" w:cs="Times New Roman"/>
+                <w:sz w:val="24"/>
+                <w:szCs w:val="24"/>
+              </w:rPr>
+            </w:pPr>
+            <w:r>
+              <w:rPr>
+                <w:rFonts w:ascii="Times New Roman" w:hAnsi="Times New Roman" w:cs="Times New Roman"/>
+                <w:sz w:val="24"/>
+                <w:szCs w:val="24"/>
+              </w:rPr>
+              <w:t>IPD Advances</w:t>
+            </w:r>
+          </w:p>
+        </w:tc>
+        <w:tc>
+          <w:tcPr>
+            <w:tcW w:w="1447" w:type="dxa"/>
+            <w:tcMar>
+              <w:left w:w="108" w:type="dxa"/>
+            </w:tcMar>
+            <w:vAlign w:val="center"/>
+          </w:tcPr>
+          <w:p>
+            <w:pPr>
+              <w:spacing w:after="0" w:line="360" w:lineRule="auto"/>
+              <w:jc w:val="center"/>
+              <w:rPr>
+                <w:rFonts w:ascii="Times New Roman" w:hAnsi="Times New Roman" w:cs="Times New Roman"/>
+                <w:sz w:val="24"/>
+                <w:szCs w:val="24"/>
+              </w:rPr>
+            </w:pPr>
+            <w:r>
+              <w:rPr>
+                <w:rFonts w:ascii="Times New Roman" w:hAnsi="Times New Roman" w:cs="Times New Roman"/>
+                <w:sz w:val="24"/>
+                <w:szCs w:val="24"/>
+              </w:rPr>
+              <w:t>28</w:t>
+            </w:r>
+          </w:p>
+        </w:tc>
+      </w:tr>
+      <w:tr>
+        <w:tc>
+          <w:tcPr>
+            <w:tcW w:w="1628" w:type="dxa"/>
+            <w:tcMar>
+              <w:left w:w="108" w:type="dxa"/>
+            </w:tcMar>
+            <w:vAlign w:val="center"/>
+          </w:tcPr>
+          <w:p>
+            <w:pPr>
+              <w:spacing w:after="0" w:line="360" w:lineRule="auto"/>
+              <w:jc w:val="center"/>
+              <w:rPr>
+                <w:rFonts w:ascii="Times New Roman" w:hAnsi="Times New Roman" w:cs="Times New Roman"/>
+                <w:sz w:val="24"/>
+                <w:szCs w:val="24"/>
+              </w:rPr>
+            </w:pPr>
+            <w:r>
+              <w:rPr>
+                <w:rFonts w:ascii="Times New Roman" w:hAnsi="Times New Roman" w:cs="Times New Roman"/>
+                <w:sz w:val="24"/>
+                <w:szCs w:val="24"/>
+              </w:rPr>
+              <w:t>3.</w:t>
+            </w:r>
+            <w:r>
+              <w:rPr>
+                <w:rFonts w:ascii="Times New Roman" w:hAnsi="Times New Roman" w:cs="Times New Roman"/>
+                <w:sz w:val="24"/>
+                <w:szCs w:val="24"/>
+              </w:rPr>
+              <w:t>2</w:t>
+            </w:r>
+            <w:r>
+              <w:rPr>
+                <w:rFonts w:ascii="Times New Roman" w:hAnsi="Times New Roman" w:cs="Times New Roman"/>
+                <w:sz w:val="24"/>
+                <w:szCs w:val="24"/>
+              </w:rPr>
+              <w:t>.</w:t>
+            </w:r>
+            <w:r>
+              <w:rPr>
+                <w:rFonts w:ascii="Times New Roman" w:hAnsi="Times New Roman" w:cs="Times New Roman"/>
+                <w:sz w:val="24"/>
+                <w:szCs w:val="24"/>
+              </w:rPr>
+              <w:t>1.1</w:t>
+            </w:r>
+            <w:r>
+              <w:rPr>
+                <w:rFonts w:ascii="Times New Roman" w:hAnsi="Times New Roman" w:cs="Times New Roman"/>
+                <w:sz w:val="24"/>
+                <w:szCs w:val="24"/>
+              </w:rPr>
+              <w:t>6</w:t>
+            </w:r>
+          </w:p>
+        </w:tc>
+        <w:tc>
+          <w:tcPr>
+            <w:tcW w:w="5951" w:type="dxa"/>
+            <w:tcMar>
+              <w:left w:w="108" w:type="dxa"/>
+            </w:tcMar>
+            <w:vAlign w:val="center"/>
+          </w:tcPr>
+          <w:p>
+            <w:pPr>
+              <w:spacing w:after="0" w:line="360" w:lineRule="auto"/>
+              <w:rPr>
+                <w:rFonts w:ascii="Times New Roman" w:hAnsi="Times New Roman" w:cs="Times New Roman"/>
+                <w:sz w:val="24"/>
+                <w:szCs w:val="24"/>
+              </w:rPr>
+            </w:pPr>
+            <w:r>
+              <w:rPr>
+                <w:rFonts w:ascii="Times New Roman" w:hAnsi="Times New Roman" w:cs="Times New Roman"/>
+                <w:sz w:val="24"/>
+                <w:szCs w:val="24"/>
+              </w:rPr>
+              <w:t>IPD Bills</w:t>
+            </w:r>
+          </w:p>
+        </w:tc>
+        <w:tc>
+          <w:tcPr>
+            <w:tcW w:w="1447" w:type="dxa"/>
+            <w:tcMar>
+              <w:left w:w="108" w:type="dxa"/>
+            </w:tcMar>
+            <w:vAlign w:val="center"/>
+          </w:tcPr>
+          <w:p>
+            <w:pPr>
+              <w:spacing w:after="0" w:line="360" w:lineRule="auto"/>
+              <w:jc w:val="center"/>
+              <w:rPr>
+                <w:rFonts w:ascii="Times New Roman" w:hAnsi="Times New Roman" w:cs="Times New Roman"/>
+                <w:sz w:val="24"/>
+                <w:szCs w:val="24"/>
+              </w:rPr>
+            </w:pPr>
+            <w:r>
+              <w:rPr>
+                <w:rFonts w:ascii="Times New Roman" w:hAnsi="Times New Roman" w:cs="Times New Roman"/>
+                <w:sz w:val="24"/>
+                <w:szCs w:val="24"/>
+              </w:rPr>
+              <w:t>28</w:t>
+            </w:r>
           </w:p>
         </w:tc>
       </w:tr>
@@ -3168,43 +4551,8 @@
     </w:p>
     <w:p>
       <w:pPr>
-        <w:spacing w:after="0" w:line="360" w:lineRule="auto"/>
+        <w:suppressAutoHyphens w:val="0"/>
         <w:jc w:val="center"/>
-        <w:rPr>
-          <w:rFonts w:ascii="Times New Roman" w:hAnsi="Times New Roman" w:cs="Times New Roman"/>
-          <w:b/>
-          <w:sz w:val="32"/>
-          <w:szCs w:val="24"/>
-        </w:rPr>
-      </w:pPr>
-    </w:p>
-    <w:p>
-      <w:pPr>
-        <w:spacing w:after="0" w:line="360" w:lineRule="auto"/>
-        <w:jc w:val="center"/>
-        <w:rPr>
-          <w:rFonts w:ascii="Times New Roman" w:hAnsi="Times New Roman" w:cs="Times New Roman"/>
-          <w:b/>
-          <w:sz w:val="32"/>
-          <w:szCs w:val="24"/>
-        </w:rPr>
-      </w:pPr>
-    </w:p>
-    <w:p>
-      <w:pPr>
-        <w:spacing w:after="0" w:line="360" w:lineRule="auto"/>
-        <w:jc w:val="center"/>
-        <w:rPr>
-          <w:rFonts w:ascii="Times New Roman" w:hAnsi="Times New Roman" w:cs="Times New Roman"/>
-          <w:b/>
-          <w:sz w:val="32"/>
-          <w:szCs w:val="24"/>
-        </w:rPr>
-      </w:pPr>
-    </w:p>
-    <w:p>
-      <w:pPr>
-        <w:suppressAutoHyphens w:val="0"/>
         <w:rPr>
           <w:rFonts w:ascii="Times New Roman" w:eastAsiaTheme="minorEastAsia" w:hAnsi="Times New Roman" w:cs="Times New Roman"/>
           <w:b/>
@@ -3213,29 +4561,6 @@
           <w:iCs/>
           <w:color w:val="FF0000"/>
           <w:sz w:val="24"/>
-          <w:szCs w:val="24"/>
-          <w:lang w:eastAsia="en-IN" w:bidi="gu-IN"/>
-        </w:rPr>
-      </w:pPr>
-      <w:r>
-        <w:rPr>
-          <w:rFonts w:ascii="Times New Roman" w:hAnsi="Times New Roman" w:cs="Times New Roman"/>
-          <w:b/>
-          <w:sz w:val="32"/>
-          <w:szCs w:val="24"/>
-        </w:rPr>
-        <w:br w:type="page"/>
-      </w:r>
-    </w:p>
-    <w:p>
-      <w:pPr>
-        <w:suppressAutoHyphens w:val="0"/>
-        <w:spacing w:after="0" w:line="360" w:lineRule="auto"/>
-        <w:jc w:val="center"/>
-        <w:rPr>
-          <w:rFonts w:ascii="Times New Roman" w:eastAsia="Times New Roman" w:hAnsi="Times New Roman" w:cs="Times New Roman"/>
-          <w:b/>
-          <w:sz w:val="32"/>
           <w:szCs w:val="24"/>
           <w:lang w:eastAsia="en-IN" w:bidi="gu-IN"/>
         </w:rPr>

</xml_diff>

<commit_message>
Part 4 work loading
</commit_message>
<xml_diff>
--- a/Week_04/ArogyaOne – Hospital Management System/ArogyaOne_Report/Part_3_Acknowledgement_Abstract_and_Table_of_Contents.docx
+++ b/Week_04/ArogyaOne – Hospital Management System/ArogyaOne_Report/Part_3_Acknowledgement_Abstract_and_Table_of_Contents.docx
@@ -1058,7 +1058,7 @@
     </w:p>
     <w:tbl>
       <w:tblPr>
-        <w:tblpPr w:leftFromText="180" w:rightFromText="180" w:vertAnchor="text" w:horzAnchor="margin" w:tblpY="505"/>
+        <w:tblpPr w:leftFromText="180" w:rightFromText="180" w:vertAnchor="text" w:horzAnchor="margin" w:tblpXSpec="center" w:tblpY="505"/>
         <w:tblW w:w="9026" w:type="dxa"/>
         <w:tblLayout w:type="fixed"/>
         <w:tblLook w:val="04A0" w:firstRow="1" w:lastRow="0" w:firstColumn="1" w:lastColumn="0" w:noHBand="0" w:noVBand="1"/>
@@ -2535,6 +2535,7 @@
     <w:tbl>
       <w:tblPr>
         <w:tblW w:w="9026" w:type="dxa"/>
+        <w:jc w:val="center"/>
         <w:tblLayout w:type="fixed"/>
         <w:tblLook w:val="04A0" w:firstRow="1" w:lastRow="0" w:firstColumn="1" w:lastColumn="0" w:noHBand="0" w:noVBand="1"/>
       </w:tblPr>
@@ -2544,6 +2545,9 @@
         <w:gridCol w:w="1447"/>
       </w:tblGrid>
       <w:tr>
+        <w:trPr>
+          <w:jc w:val="center"/>
+        </w:trPr>
         <w:tc>
           <w:tcPr>
             <w:tcW w:w="1628" w:type="dxa"/>
@@ -2636,6 +2640,9 @@
         </w:tc>
       </w:tr>
       <w:tr>
+        <w:trPr>
+          <w:jc w:val="center"/>
+        </w:trPr>
         <w:tc>
           <w:tcPr>
             <w:tcW w:w="1628" w:type="dxa"/>
@@ -2729,6 +2736,9 @@
         </w:tc>
       </w:tr>
       <w:tr>
+        <w:trPr>
+          <w:jc w:val="center"/>
+        </w:trPr>
         <w:tc>
           <w:tcPr>
             <w:tcW w:w="1628" w:type="dxa"/>
@@ -2838,6 +2848,9 @@
         </w:tc>
       </w:tr>
       <w:tr>
+        <w:trPr>
+          <w:jc w:val="center"/>
+        </w:trPr>
         <w:tc>
           <w:tcPr>
             <w:tcW w:w="1628" w:type="dxa"/>
@@ -2947,6 +2960,9 @@
         </w:tc>
       </w:tr>
       <w:tr>
+        <w:trPr>
+          <w:jc w:val="center"/>
+        </w:trPr>
         <w:tc>
           <w:tcPr>
             <w:tcW w:w="1628" w:type="dxa"/>
@@ -3056,6 +3072,9 @@
         </w:tc>
       </w:tr>
       <w:tr>
+        <w:trPr>
+          <w:jc w:val="center"/>
+        </w:trPr>
         <w:tc>
           <w:tcPr>
             <w:tcW w:w="1628" w:type="dxa"/>
@@ -3165,6 +3184,9 @@
         </w:tc>
       </w:tr>
       <w:tr>
+        <w:trPr>
+          <w:jc w:val="center"/>
+        </w:trPr>
         <w:tc>
           <w:tcPr>
             <w:tcW w:w="1628" w:type="dxa"/>
@@ -3274,6 +3296,9 @@
         </w:tc>
       </w:tr>
       <w:tr>
+        <w:trPr>
+          <w:jc w:val="center"/>
+        </w:trPr>
         <w:tc>
           <w:tcPr>
             <w:tcW w:w="1628" w:type="dxa"/>
@@ -3383,6 +3408,9 @@
         </w:tc>
       </w:tr>
       <w:tr>
+        <w:trPr>
+          <w:jc w:val="center"/>
+        </w:trPr>
         <w:tc>
           <w:tcPr>
             <w:tcW w:w="1628" w:type="dxa"/>
@@ -3502,6 +3530,9 @@
         </w:tc>
       </w:tr>
       <w:tr>
+        <w:trPr>
+          <w:jc w:val="center"/>
+        </w:trPr>
         <w:tc>
           <w:tcPr>
             <w:tcW w:w="1628" w:type="dxa"/>
@@ -3611,6 +3642,9 @@
         </w:tc>
       </w:tr>
       <w:tr>
+        <w:trPr>
+          <w:jc w:val="center"/>
+        </w:trPr>
         <w:tc>
           <w:tcPr>
             <w:tcW w:w="1628" w:type="dxa"/>
@@ -3720,6 +3754,9 @@
         </w:tc>
       </w:tr>
       <w:tr>
+        <w:trPr>
+          <w:jc w:val="center"/>
+        </w:trPr>
         <w:tc>
           <w:tcPr>
             <w:tcW w:w="1628" w:type="dxa"/>
@@ -3829,6 +3866,9 @@
         </w:tc>
       </w:tr>
       <w:tr>
+        <w:trPr>
+          <w:jc w:val="center"/>
+        </w:trPr>
         <w:tc>
           <w:tcPr>
             <w:tcW w:w="1628" w:type="dxa"/>
@@ -3938,6 +3978,9 @@
         </w:tc>
       </w:tr>
       <w:tr>
+        <w:trPr>
+          <w:jc w:val="center"/>
+        </w:trPr>
         <w:tc>
           <w:tcPr>
             <w:tcW w:w="1628" w:type="dxa"/>
@@ -4057,6 +4100,9 @@
         </w:tc>
       </w:tr>
       <w:tr>
+        <w:trPr>
+          <w:jc w:val="center"/>
+        </w:trPr>
         <w:tc>
           <w:tcPr>
             <w:tcW w:w="1628" w:type="dxa"/>
@@ -4166,6 +4212,9 @@
         </w:tc>
       </w:tr>
       <w:tr>
+        <w:trPr>
+          <w:jc w:val="center"/>
+        </w:trPr>
         <w:tc>
           <w:tcPr>
             <w:tcW w:w="1628" w:type="dxa"/>
@@ -4214,15 +4263,7 @@
                 <w:sz w:val="24"/>
                 <w:szCs w:val="24"/>
               </w:rPr>
-              <w:t>1.1</w:t>
-            </w:r>
-            <w:r>
-              <w:rPr>
-                <w:rFonts w:ascii="Times New Roman" w:hAnsi="Times New Roman" w:cs="Times New Roman"/>
-                <w:sz w:val="24"/>
-                <w:szCs w:val="24"/>
-              </w:rPr>
-              <w:t>5</w:t>
+              <w:t>1.15</w:t>
             </w:r>
           </w:p>
         </w:tc>
@@ -4283,6 +4324,9 @@
         </w:tc>
       </w:tr>
       <w:tr>
+        <w:trPr>
+          <w:jc w:val="center"/>
+        </w:trPr>
         <w:tc>
           <w:tcPr>
             <w:tcW w:w="1628" w:type="dxa"/>
@@ -4331,15 +4375,7 @@
                 <w:sz w:val="24"/>
                 <w:szCs w:val="24"/>
               </w:rPr>
-              <w:t>1.1</w:t>
-            </w:r>
-            <w:r>
-              <w:rPr>
-                <w:rFonts w:ascii="Times New Roman" w:hAnsi="Times New Roman" w:cs="Times New Roman"/>
-                <w:sz w:val="24"/>
-                <w:szCs w:val="24"/>
-              </w:rPr>
-              <w:t>6</w:t>
+              <w:t>1.16</w:t>
             </w:r>
           </w:p>
         </w:tc>
@@ -9498,6 +9534,7 @@
   <w:style w:type="character" w:default="1" w:styleId="DefaultParagraphFont">
     <w:name w:val="Default Paragraph Font"/>
     <w:uiPriority w:val="1"/>
+    <w:semiHidden/>
     <w:unhideWhenUsed/>
   </w:style>
   <w:style w:type="table" w:default="1" w:styleId="TableNormal">
@@ -10020,6 +10057,10 @@
 </file>
 
 <file path=customXml/item1.xml><?xml version="1.0" encoding="utf-8"?>
+<b:Sources xmlns:b="http://schemas.openxmlformats.org/officeDocument/2006/bibliography" xmlns="http://schemas.openxmlformats.org/officeDocument/2006/bibliography" SelectedStyle="\APASixthEditionOfficeOnline.xsl" StyleName="APA" Version="6"/>
+</file>
+
+<file path=customXml/item2.xml><?xml version="1.0" encoding="utf-8"?>
 <s:customData xmlns="http://www.wps.cn/officeDocument/2013/wpsCustomData" xmlns:s="http://www.wps.cn/officeDocument/2013/wpsCustomData">
   <customSectProps>
     <customSectPr/>
@@ -10027,22 +10068,18 @@
 </s:customData>
 </file>
 
-<file path=customXml/item2.xml><?xml version="1.0" encoding="utf-8"?>
-<b:Sources xmlns:b="http://schemas.openxmlformats.org/officeDocument/2006/bibliography" xmlns="http://schemas.openxmlformats.org/officeDocument/2006/bibliography" SelectedStyle="\APASixthEditionOfficeOnline.xsl" StyleName="APA" Version="6"/>
+<file path=customXml/itemProps1.xml><?xml version="1.0" encoding="utf-8"?>
+<ds:datastoreItem xmlns:ds="http://schemas.openxmlformats.org/officeDocument/2006/customXml" ds:itemID="{1A27E352-9BE0-4888-A060-6C880FD98FF3}">
+  <ds:schemaRefs>
+    <ds:schemaRef ds:uri="http://schemas.openxmlformats.org/officeDocument/2006/bibliography"/>
+  </ds:schemaRefs>
+</ds:datastoreItem>
 </file>
 
-<file path=customXml/itemProps1.xml><?xml version="1.0" encoding="utf-8"?>
+<file path=customXml/itemProps2.xml><?xml version="1.0" encoding="utf-8"?>
 <ds:datastoreItem xmlns:ds="http://schemas.openxmlformats.org/officeDocument/2006/customXml" ds:itemID="{B1977F7D-205B-4081-913C-38D41E755F92}">
   <ds:schemaRefs>
     <ds:schemaRef ds:uri="http://www.wps.cn/officeDocument/2013/wpsCustomData"/>
   </ds:schemaRefs>
 </ds:datastoreItem>
-</file>
-
-<file path=customXml/itemProps2.xml><?xml version="1.0" encoding="utf-8"?>
-<ds:datastoreItem xmlns:ds="http://schemas.openxmlformats.org/officeDocument/2006/customXml" ds:itemID="{1A27E352-9BE0-4888-A060-6C880FD98FF3}">
-  <ds:schemaRefs>
-    <ds:schemaRef ds:uri="http://schemas.openxmlformats.org/officeDocument/2006/bibliography"/>
-  </ds:schemaRefs>
-</ds:datastoreItem>
 </file>
</xml_diff>